<commit_message>
Fill team member names
</commit_message>
<xml_diff>
--- a/report.docx
+++ b/report.docx
@@ -125,6 +125,294 @@
               </w:rPr>
               <w:t>主要分工</w:t>
             </w:r>
+          </w:p>
+        </w:tc>
+      </w:tr>
+      <w:tr>
+        <w:tc>
+          <w:tcPr>
+            <w:tcW w:type="dxa" w:w="2412"/>
+          </w:tcPr>
+          <w:p>
+            <w:r>
+              <w:t>张先哲（组长）</w:t>
+            </w:r>
+          </w:p>
+        </w:tc>
+        <w:tc>
+          <w:tcPr>
+            <w:tcW w:type="dxa" w:w="2412"/>
+          </w:tcPr>
+          <w:p>
+            <w:r/>
+          </w:p>
+        </w:tc>
+        <w:tc>
+          <w:tcPr>
+            <w:tcW w:type="dxa" w:w="2412"/>
+          </w:tcPr>
+          <w:p>
+            <w:r/>
+          </w:p>
+        </w:tc>
+        <w:tc>
+          <w:tcPr>
+            <w:tcW w:type="dxa" w:w="2412"/>
+          </w:tcPr>
+          <w:p>
+            <w:r/>
+          </w:p>
+        </w:tc>
+      </w:tr>
+      <w:tr>
+        <w:tc>
+          <w:tcPr>
+            <w:tcW w:type="dxa" w:w="2412"/>
+          </w:tcPr>
+          <w:p>
+            <w:r>
+              <w:t>葛洪宇</w:t>
+            </w:r>
+          </w:p>
+        </w:tc>
+        <w:tc>
+          <w:tcPr>
+            <w:tcW w:type="dxa" w:w="2412"/>
+          </w:tcPr>
+          <w:p>
+            <w:r/>
+          </w:p>
+        </w:tc>
+        <w:tc>
+          <w:tcPr>
+            <w:tcW w:type="dxa" w:w="2412"/>
+          </w:tcPr>
+          <w:p>
+            <w:r/>
+          </w:p>
+        </w:tc>
+        <w:tc>
+          <w:tcPr>
+            <w:tcW w:type="dxa" w:w="2412"/>
+          </w:tcPr>
+          <w:p>
+            <w:r/>
+          </w:p>
+        </w:tc>
+      </w:tr>
+      <w:tr>
+        <w:tc>
+          <w:tcPr>
+            <w:tcW w:type="dxa" w:w="2412"/>
+          </w:tcPr>
+          <w:p>
+            <w:r>
+              <w:t>刘遥</w:t>
+            </w:r>
+          </w:p>
+        </w:tc>
+        <w:tc>
+          <w:tcPr>
+            <w:tcW w:type="dxa" w:w="2412"/>
+          </w:tcPr>
+          <w:p>
+            <w:r/>
+          </w:p>
+        </w:tc>
+        <w:tc>
+          <w:tcPr>
+            <w:tcW w:type="dxa" w:w="2412"/>
+          </w:tcPr>
+          <w:p>
+            <w:r/>
+          </w:p>
+        </w:tc>
+        <w:tc>
+          <w:tcPr>
+            <w:tcW w:type="dxa" w:w="2412"/>
+          </w:tcPr>
+          <w:p>
+            <w:r/>
+          </w:p>
+        </w:tc>
+      </w:tr>
+      <w:tr>
+        <w:tc>
+          <w:tcPr>
+            <w:tcW w:type="dxa" w:w="2412"/>
+          </w:tcPr>
+          <w:p>
+            <w:r>
+              <w:t>马新洋</w:t>
+            </w:r>
+          </w:p>
+        </w:tc>
+        <w:tc>
+          <w:tcPr>
+            <w:tcW w:type="dxa" w:w="2412"/>
+          </w:tcPr>
+          <w:p>
+            <w:r/>
+          </w:p>
+        </w:tc>
+        <w:tc>
+          <w:tcPr>
+            <w:tcW w:type="dxa" w:w="2412"/>
+          </w:tcPr>
+          <w:p>
+            <w:r/>
+          </w:p>
+        </w:tc>
+        <w:tc>
+          <w:tcPr>
+            <w:tcW w:type="dxa" w:w="2412"/>
+          </w:tcPr>
+          <w:p>
+            <w:r/>
+          </w:p>
+        </w:tc>
+      </w:tr>
+      <w:tr>
+        <w:tc>
+          <w:tcPr>
+            <w:tcW w:type="dxa" w:w="2412"/>
+          </w:tcPr>
+          <w:p>
+            <w:r>
+              <w:t>张晓宇</w:t>
+            </w:r>
+          </w:p>
+        </w:tc>
+        <w:tc>
+          <w:tcPr>
+            <w:tcW w:type="dxa" w:w="2412"/>
+          </w:tcPr>
+          <w:p>
+            <w:r/>
+          </w:p>
+        </w:tc>
+        <w:tc>
+          <w:tcPr>
+            <w:tcW w:type="dxa" w:w="2412"/>
+          </w:tcPr>
+          <w:p>
+            <w:r/>
+          </w:p>
+        </w:tc>
+        <w:tc>
+          <w:tcPr>
+            <w:tcW w:type="dxa" w:w="2412"/>
+          </w:tcPr>
+          <w:p>
+            <w:r/>
+          </w:p>
+        </w:tc>
+      </w:tr>
+      <w:tr>
+        <w:tc>
+          <w:tcPr>
+            <w:tcW w:type="dxa" w:w="2412"/>
+          </w:tcPr>
+          <w:p>
+            <w:r>
+              <w:t>刘文琪</w:t>
+            </w:r>
+          </w:p>
+        </w:tc>
+        <w:tc>
+          <w:tcPr>
+            <w:tcW w:type="dxa" w:w="2412"/>
+          </w:tcPr>
+          <w:p>
+            <w:r/>
+          </w:p>
+        </w:tc>
+        <w:tc>
+          <w:tcPr>
+            <w:tcW w:type="dxa" w:w="2412"/>
+          </w:tcPr>
+          <w:p>
+            <w:r/>
+          </w:p>
+        </w:tc>
+        <w:tc>
+          <w:tcPr>
+            <w:tcW w:type="dxa" w:w="2412"/>
+          </w:tcPr>
+          <w:p>
+            <w:r/>
+          </w:p>
+        </w:tc>
+      </w:tr>
+      <w:tr>
+        <w:tc>
+          <w:tcPr>
+            <w:tcW w:type="dxa" w:w="2412"/>
+          </w:tcPr>
+          <w:p>
+            <w:r>
+              <w:t>陈俊名</w:t>
+            </w:r>
+          </w:p>
+        </w:tc>
+        <w:tc>
+          <w:tcPr>
+            <w:tcW w:type="dxa" w:w="2412"/>
+          </w:tcPr>
+          <w:p>
+            <w:r/>
+          </w:p>
+        </w:tc>
+        <w:tc>
+          <w:tcPr>
+            <w:tcW w:type="dxa" w:w="2412"/>
+          </w:tcPr>
+          <w:p>
+            <w:r/>
+          </w:p>
+        </w:tc>
+        <w:tc>
+          <w:tcPr>
+            <w:tcW w:type="dxa" w:w="2412"/>
+          </w:tcPr>
+          <w:p>
+            <w:r/>
+          </w:p>
+        </w:tc>
+      </w:tr>
+      <w:tr>
+        <w:tc>
+          <w:tcPr>
+            <w:tcW w:type="dxa" w:w="2412"/>
+          </w:tcPr>
+          <w:p>
+            <w:r>
+              <w:t>赵浩男</w:t>
+            </w:r>
+          </w:p>
+        </w:tc>
+        <w:tc>
+          <w:tcPr>
+            <w:tcW w:type="dxa" w:w="2412"/>
+          </w:tcPr>
+          <w:p>
+            <w:r/>
+          </w:p>
+        </w:tc>
+        <w:tc>
+          <w:tcPr>
+            <w:tcW w:type="dxa" w:w="2412"/>
+          </w:tcPr>
+          <w:p>
+            <w:r/>
+          </w:p>
+        </w:tc>
+        <w:tc>
+          <w:tcPr>
+            <w:tcW w:type="dxa" w:w="2412"/>
+          </w:tcPr>
+          <w:p>
+            <w:r/>
           </w:p>
         </w:tc>
       </w:tr>

</xml_diff>

<commit_message>
Simplify team member table
</commit_message>
<xml_diff>
--- a/report.docx
+++ b/report.docx
@@ -33,97 +33,19 @@
       <w:tblPr>
         <w:tblStyle w:val="TableGrid"/>
         <w:tblW w:type="auto" w:w="0"/>
-        <w:jc w:val="center"/>
         <w:tblLook w:firstColumn="1" w:firstRow="1" w:lastColumn="0" w:lastRow="0" w:noHBand="0" w:noVBand="1" w:val="04A0"/>
       </w:tblPr>
       <w:tblGrid>
-        <w:gridCol w:w="2412"/>
-        <w:gridCol w:w="2412"/>
-        <w:gridCol w:w="2412"/>
-        <w:gridCol w:w="2412"/>
+        <w:gridCol w:w="9648"/>
       </w:tblGrid>
       <w:tr>
         <w:tc>
           <w:tcPr>
-            <w:tcW w:type="dxa" w:w="2412"/>
-            <w:vAlign w:val="center"/>
-            <w:shd w:fill="D9EAF7"/>
+            <w:tcW w:type="dxa" w:w="9648"/>
           </w:tcPr>
           <w:p>
-            <w:pPr>
-              <w:jc w:val="center"/>
-            </w:pPr>
-            <w:r/>
             <w:r>
-              <w:rPr>
-                <w:rFonts w:ascii="Times New Roman" w:hAnsi="Times New Roman" w:eastAsia="??"/>
-                <w:b/>
-                <w:sz w:val="21"/>
-              </w:rPr>
-              <w:t>姓名</w:t>
-            </w:r>
-          </w:p>
-        </w:tc>
-        <w:tc>
-          <w:tcPr>
-            <w:tcW w:type="dxa" w:w="2412"/>
-            <w:vAlign w:val="center"/>
-            <w:shd w:fill="D9EAF7"/>
-          </w:tcPr>
-          <w:p>
-            <w:pPr>
-              <w:jc w:val="center"/>
-            </w:pPr>
-            <w:r/>
-            <w:r>
-              <w:rPr>
-                <w:rFonts w:ascii="Times New Roman" w:hAnsi="Times New Roman" w:eastAsia="??"/>
-                <w:b/>
-                <w:sz w:val="21"/>
-              </w:rPr>
-              <w:t>学号</w:t>
-            </w:r>
-          </w:p>
-        </w:tc>
-        <w:tc>
-          <w:tcPr>
-            <w:tcW w:type="dxa" w:w="2412"/>
-            <w:vAlign w:val="center"/>
-            <w:shd w:fill="D9EAF7"/>
-          </w:tcPr>
-          <w:p>
-            <w:pPr>
-              <w:jc w:val="center"/>
-            </w:pPr>
-            <w:r/>
-            <w:r>
-              <w:rPr>
-                <w:rFonts w:ascii="Times New Roman" w:hAnsi="Times New Roman" w:eastAsia="??"/>
-                <w:b/>
-                <w:sz w:val="21"/>
-              </w:rPr>
-              <w:t>班级</w:t>
-            </w:r>
-          </w:p>
-        </w:tc>
-        <w:tc>
-          <w:tcPr>
-            <w:tcW w:type="dxa" w:w="2412"/>
-            <w:vAlign w:val="center"/>
-            <w:shd w:fill="D9EAF7"/>
-          </w:tcPr>
-          <w:p>
-            <w:pPr>
-              <w:jc w:val="center"/>
-            </w:pPr>
-            <w:r/>
-            <w:r>
-              <w:rPr>
-                <w:rFonts w:ascii="Times New Roman" w:hAnsi="Times New Roman" w:eastAsia="??"/>
-                <w:b/>
-                <w:sz w:val="21"/>
-              </w:rPr>
-              <w:t>主要分工</w:t>
+              <w:t>组员</w:t>
             </w:r>
           </w:p>
         </w:tc>
@@ -131,7 +53,7 @@
       <w:tr>
         <w:tc>
           <w:tcPr>
-            <w:tcW w:type="dxa" w:w="2412"/>
+            <w:tcW w:type="dxa" w:w="9648"/>
           </w:tcPr>
           <w:p>
             <w:r>
@@ -139,35 +61,11 @@
             </w:r>
           </w:p>
         </w:tc>
-        <w:tc>
-          <w:tcPr>
-            <w:tcW w:type="dxa" w:w="2412"/>
-          </w:tcPr>
-          <w:p>
-            <w:r/>
-          </w:p>
-        </w:tc>
-        <w:tc>
-          <w:tcPr>
-            <w:tcW w:type="dxa" w:w="2412"/>
-          </w:tcPr>
-          <w:p>
-            <w:r/>
-          </w:p>
-        </w:tc>
-        <w:tc>
-          <w:tcPr>
-            <w:tcW w:type="dxa" w:w="2412"/>
-          </w:tcPr>
-          <w:p>
-            <w:r/>
-          </w:p>
-        </w:tc>
       </w:tr>
       <w:tr>
         <w:tc>
           <w:tcPr>
-            <w:tcW w:type="dxa" w:w="2412"/>
+            <w:tcW w:type="dxa" w:w="9648"/>
           </w:tcPr>
           <w:p>
             <w:r>
@@ -175,35 +73,11 @@
             </w:r>
           </w:p>
         </w:tc>
-        <w:tc>
-          <w:tcPr>
-            <w:tcW w:type="dxa" w:w="2412"/>
-          </w:tcPr>
-          <w:p>
-            <w:r/>
-          </w:p>
-        </w:tc>
-        <w:tc>
-          <w:tcPr>
-            <w:tcW w:type="dxa" w:w="2412"/>
-          </w:tcPr>
-          <w:p>
-            <w:r/>
-          </w:p>
-        </w:tc>
-        <w:tc>
-          <w:tcPr>
-            <w:tcW w:type="dxa" w:w="2412"/>
-          </w:tcPr>
-          <w:p>
-            <w:r/>
-          </w:p>
-        </w:tc>
       </w:tr>
       <w:tr>
         <w:tc>
           <w:tcPr>
-            <w:tcW w:type="dxa" w:w="2412"/>
+            <w:tcW w:type="dxa" w:w="9648"/>
           </w:tcPr>
           <w:p>
             <w:r>
@@ -211,35 +85,11 @@
             </w:r>
           </w:p>
         </w:tc>
-        <w:tc>
-          <w:tcPr>
-            <w:tcW w:type="dxa" w:w="2412"/>
-          </w:tcPr>
-          <w:p>
-            <w:r/>
-          </w:p>
-        </w:tc>
-        <w:tc>
-          <w:tcPr>
-            <w:tcW w:type="dxa" w:w="2412"/>
-          </w:tcPr>
-          <w:p>
-            <w:r/>
-          </w:p>
-        </w:tc>
-        <w:tc>
-          <w:tcPr>
-            <w:tcW w:type="dxa" w:w="2412"/>
-          </w:tcPr>
-          <w:p>
-            <w:r/>
-          </w:p>
-        </w:tc>
       </w:tr>
       <w:tr>
         <w:tc>
           <w:tcPr>
-            <w:tcW w:type="dxa" w:w="2412"/>
+            <w:tcW w:type="dxa" w:w="9648"/>
           </w:tcPr>
           <w:p>
             <w:r>
@@ -247,35 +97,11 @@
             </w:r>
           </w:p>
         </w:tc>
-        <w:tc>
-          <w:tcPr>
-            <w:tcW w:type="dxa" w:w="2412"/>
-          </w:tcPr>
-          <w:p>
-            <w:r/>
-          </w:p>
-        </w:tc>
-        <w:tc>
-          <w:tcPr>
-            <w:tcW w:type="dxa" w:w="2412"/>
-          </w:tcPr>
-          <w:p>
-            <w:r/>
-          </w:p>
-        </w:tc>
-        <w:tc>
-          <w:tcPr>
-            <w:tcW w:type="dxa" w:w="2412"/>
-          </w:tcPr>
-          <w:p>
-            <w:r/>
-          </w:p>
-        </w:tc>
       </w:tr>
       <w:tr>
         <w:tc>
           <w:tcPr>
-            <w:tcW w:type="dxa" w:w="2412"/>
+            <w:tcW w:type="dxa" w:w="9648"/>
           </w:tcPr>
           <w:p>
             <w:r>
@@ -283,35 +109,11 @@
             </w:r>
           </w:p>
         </w:tc>
-        <w:tc>
-          <w:tcPr>
-            <w:tcW w:type="dxa" w:w="2412"/>
-          </w:tcPr>
-          <w:p>
-            <w:r/>
-          </w:p>
-        </w:tc>
-        <w:tc>
-          <w:tcPr>
-            <w:tcW w:type="dxa" w:w="2412"/>
-          </w:tcPr>
-          <w:p>
-            <w:r/>
-          </w:p>
-        </w:tc>
-        <w:tc>
-          <w:tcPr>
-            <w:tcW w:type="dxa" w:w="2412"/>
-          </w:tcPr>
-          <w:p>
-            <w:r/>
-          </w:p>
-        </w:tc>
       </w:tr>
       <w:tr>
         <w:tc>
           <w:tcPr>
-            <w:tcW w:type="dxa" w:w="2412"/>
+            <w:tcW w:type="dxa" w:w="9648"/>
           </w:tcPr>
           <w:p>
             <w:r>
@@ -319,35 +121,11 @@
             </w:r>
           </w:p>
         </w:tc>
-        <w:tc>
-          <w:tcPr>
-            <w:tcW w:type="dxa" w:w="2412"/>
-          </w:tcPr>
-          <w:p>
-            <w:r/>
-          </w:p>
-        </w:tc>
-        <w:tc>
-          <w:tcPr>
-            <w:tcW w:type="dxa" w:w="2412"/>
-          </w:tcPr>
-          <w:p>
-            <w:r/>
-          </w:p>
-        </w:tc>
-        <w:tc>
-          <w:tcPr>
-            <w:tcW w:type="dxa" w:w="2412"/>
-          </w:tcPr>
-          <w:p>
-            <w:r/>
-          </w:p>
-        </w:tc>
       </w:tr>
       <w:tr>
         <w:tc>
           <w:tcPr>
-            <w:tcW w:type="dxa" w:w="2412"/>
+            <w:tcW w:type="dxa" w:w="9648"/>
           </w:tcPr>
           <w:p>
             <w:r>
@@ -355,64 +133,16 @@
             </w:r>
           </w:p>
         </w:tc>
-        <w:tc>
-          <w:tcPr>
-            <w:tcW w:type="dxa" w:w="2412"/>
-          </w:tcPr>
-          <w:p>
-            <w:r/>
-          </w:p>
-        </w:tc>
-        <w:tc>
-          <w:tcPr>
-            <w:tcW w:type="dxa" w:w="2412"/>
-          </w:tcPr>
-          <w:p>
-            <w:r/>
-          </w:p>
-        </w:tc>
-        <w:tc>
-          <w:tcPr>
-            <w:tcW w:type="dxa" w:w="2412"/>
-          </w:tcPr>
-          <w:p>
-            <w:r/>
-          </w:p>
-        </w:tc>
       </w:tr>
       <w:tr>
         <w:tc>
           <w:tcPr>
-            <w:tcW w:type="dxa" w:w="2412"/>
+            <w:tcW w:type="dxa" w:w="9648"/>
           </w:tcPr>
           <w:p>
             <w:r>
               <w:t>赵浩男</w:t>
             </w:r>
-          </w:p>
-        </w:tc>
-        <w:tc>
-          <w:tcPr>
-            <w:tcW w:type="dxa" w:w="2412"/>
-          </w:tcPr>
-          <w:p>
-            <w:r/>
-          </w:p>
-        </w:tc>
-        <w:tc>
-          <w:tcPr>
-            <w:tcW w:type="dxa" w:w="2412"/>
-          </w:tcPr>
-          <w:p>
-            <w:r/>
-          </w:p>
-        </w:tc>
-        <w:tc>
-          <w:tcPr>
-            <w:tcW w:type="dxa" w:w="2412"/>
-          </w:tcPr>
-          <w:p>
-            <w:r/>
           </w:p>
         </w:tc>
       </w:tr>

</xml_diff>

<commit_message>
Add checkpoint inference reproduction script
</commit_message>
<xml_diff>
--- a/report.docx
+++ b/report.docx
@@ -1735,7 +1735,7 @@
           <w:rFonts w:ascii="SimSun" w:hAnsi="SimSun"/>
           <w:sz w:val="21"/>
         </w:rPr>
-        <w:t>本实验提供两种复现方式：第一种用于快速核验最终分数；第二种用于获取完整代码、模型参数和数据处理流程。</w:t>
+        <w:t>本实验提供三种复现方式：快速复算最终分数，加载已训练 checkpoint 重新导出结果，以及可选的完整重新训练。</w:t>
       </w:r>
     </w:p>
     <w:p>
@@ -1774,7 +1774,7 @@
           <w:rFonts w:ascii="SimSun" w:hAnsi="SimSun"/>
           <w:sz w:val="21"/>
         </w:rPr>
-        <w:t>该命令会根据 results_top10 中保存的最终 Top-10 推荐结果重新计算 Recall@10 和 NDCG@10，输出应与 final_results.csv 一致。</w:t>
+        <w:t>该命令直接使用提交包中的 results_top10 文件复算 Recall@10 和 NDCG@10，输出应与 final_results.csv 一致。</w:t>
       </w:r>
     </w:p>
     <w:p>
@@ -1786,7 +1786,7 @@
           <w:rFonts w:ascii="SimSun" w:hAnsi="SimSun"/>
           <w:sz w:val="21"/>
         </w:rPr>
-        <w:t>2. 获取完整代码和 checkpoint</w:t>
+        <w:t>2. 加载 checkpoint 重新导出最终结果</w:t>
       </w:r>
     </w:p>
     <w:p>
@@ -1795,7 +1795,7 @@
           <w:rFonts w:ascii="SimSun" w:hAnsi="SimSun"/>
           <w:sz w:val="21"/>
         </w:rPr>
-        <w:t>邮件附件不包含 checkpoint。完整模型参数保存在 GitHub 仓库的 models/checkpoints/ 目录中，使用 Git LFS 管理：</w:t>
+        <w:t>邮件附件不包含 checkpoint。完整模型参数保存在 GitHub 仓库的 models/checkpoints/ 目录中，使用 Git LFS 管理。先获取仓库和参数：</w:t>
       </w:r>
     </w:p>
     <w:p>
@@ -1840,27 +1840,6 @@
           <w:rFonts w:ascii="SimSun" w:hAnsi="SimSun"/>
           <w:sz w:val="21"/>
         </w:rPr>
-        <w:t>下载完成后，models/checkpoints/ 下应包含主要实验的 .pth 模型参数文件。</w:t>
-      </w:r>
-    </w:p>
-    <w:p>
-      <w:pPr>
-        <w:pStyle w:val="Heading2"/>
-      </w:pPr>
-      <w:r>
-        <w:rPr>
-          <w:rFonts w:ascii="SimSun" w:hAnsi="SimSun"/>
-          <w:sz w:val="21"/>
-        </w:rPr>
-        <w:t>3. 安装依赖</w:t>
-      </w:r>
-    </w:p>
-    <w:p>
-      <w:r>
-        <w:rPr>
-          <w:rFonts w:ascii="SimSun" w:hAnsi="SimSun"/>
-          <w:sz w:val="21"/>
-        </w:rPr>
         <w:t>进入代码目录并安装依赖：</w:t>
       </w:r>
     </w:p>
@@ -1892,24 +1871,12 @@
       </w:r>
     </w:p>
     <w:p>
-      <w:pPr>
-        <w:pStyle w:val="Heading2"/>
-      </w:pPr>
       <w:r>
         <w:rPr>
           <w:rFonts w:ascii="SimSun" w:hAnsi="SimSun"/>
           <w:sz w:val="21"/>
         </w:rPr>
-        <w:t>4. 下载作业数据</w:t>
-      </w:r>
-    </w:p>
-    <w:p>
-      <w:r>
-        <w:rPr>
-          <w:rFonts w:ascii="SimSun" w:hAnsi="SimSun"/>
-          <w:sz w:val="21"/>
-        </w:rPr>
-        <w:t>数据链接来自作业 PDF 中的 Amazon Reviews 2023 5-Core train/dev/test/meta 文件。代码中把 dev 命名为 valid：</w:t>
+        <w:t>下载作业 PDF 中对应的三个数据集。代码中把 dev 命名为 valid：</w:t>
       </w:r>
     </w:p>
     <w:p>
@@ -1940,24 +1907,12 @@
       </w:r>
     </w:p>
     <w:p>
-      <w:pPr>
-        <w:pStyle w:val="Heading2"/>
-      </w:pPr>
       <w:r>
         <w:rPr>
           <w:rFonts w:ascii="SimSun" w:hAnsi="SimSun"/>
           <w:sz w:val="21"/>
         </w:rPr>
-        <w:t>5. 处理数据</w:t>
-      </w:r>
-    </w:p>
-    <w:p>
-      <w:r>
-        <w:rPr>
-          <w:rFonts w:ascii="SimSun" w:hAnsi="SimSun"/>
-          <w:sz w:val="21"/>
-        </w:rPr>
-        <w:t>普通序列模型和 UniSRec 使用普通处理结果，RichUniSRec 使用 rich metadata 和用户历史特征。以 Musical_Instruments 为例：</w:t>
+        <w:t>处理普通数据和 Rich 数据。下面是加载 checkpoint 导出结果所需的处理命令：</w:t>
       </w:r>
     </w:p>
     <w:p>
@@ -1975,7 +1930,43 @@
           <w:rFonts w:ascii="Courier New" w:hAnsi="Courier New"/>
           <w:sz w:val="18"/>
         </w:rPr>
+        <w:t>python dataset/process_amazon.py --domain Industrial_and_Scientific --device cuda --output_dir dataset/processed</w:t>
+      </w:r>
+    </w:p>
+    <w:p>
+      <w:r>
+        <w:rPr>
+          <w:rFonts w:ascii="Courier New" w:hAnsi="Courier New"/>
+          <w:sz w:val="18"/>
+        </w:rPr>
+        <w:t>python dataset/process_amazon.py --domain CDs_and_Vinyl --device cuda --output_dir dataset/processed --skip_plm_features</w:t>
+      </w:r>
+    </w:p>
+    <w:p>
+      <w:r>
+        <w:rPr>
+          <w:rFonts w:ascii="Courier New" w:hAnsi="Courier New"/>
+          <w:sz w:val="18"/>
+        </w:rPr>
         <w:t>python dataset/process_amazon.py --domain Musical_Instruments --device cuda --output_dir dataset/processed --output_domain Musical_Instruments_Rich --rich_metadata --with_user_features</w:t>
+      </w:r>
+    </w:p>
+    <w:p>
+      <w:r>
+        <w:rPr>
+          <w:rFonts w:ascii="Courier New" w:hAnsi="Courier New"/>
+          <w:sz w:val="18"/>
+        </w:rPr>
+        <w:t>python dataset/process_amazon.py --domain Industrial_and_Scientific --device cuda --output_dir dataset/processed --output_domain Industrial_and_Scientific_Rich --rich_metadata --with_user_features</w:t>
+      </w:r>
+    </w:p>
+    <w:p>
+      <w:r>
+        <w:rPr>
+          <w:rFonts w:ascii="Courier New" w:hAnsi="Courier New"/>
+          <w:sz w:val="18"/>
+        </w:rPr>
+        <w:t>python dataset/process_amazon.py --domain CDs_and_Vinyl --device cuda --output_dir dataset/processed --output_domain CDs_and_Vinyl_Rich --rich_metadata --with_user_features</w:t>
       </w:r>
     </w:p>
     <w:p>
@@ -1984,7 +1975,25 @@
           <w:rFonts w:ascii="SimSun" w:hAnsi="SimSun"/>
           <w:sz w:val="21"/>
         </w:rPr>
-        <w:t>另外两个数据集将 --domain 替换为 Industrial_and_Scientific 或 CDs_and_Vinyl 即可。</w:t>
+        <w:t>然后直接加载 models/checkpoints/ 中的模型参数，重新导出 test ranklist 并做 RRF 融合：</w:t>
+      </w:r>
+    </w:p>
+    <w:p>
+      <w:r>
+        <w:rPr>
+          <w:rFonts w:ascii="Courier New" w:hAnsi="Courier New"/>
+          <w:sz w:val="18"/>
+        </w:rPr>
+        <w:t>bash scripts/reproduce_from_checkpoints.sh</w:t>
+      </w:r>
+    </w:p>
+    <w:p>
+      <w:r>
+        <w:rPr>
+          <w:rFonts w:ascii="SimSun" w:hAnsi="SimSun"/>
+          <w:sz w:val="21"/>
+        </w:rPr>
+        <w:t>该脚本会调用 scripts/export_ranklist.py 读取 checkpoint，再调用 scripts/rrf_fusion.py 融合多个模型的排序结果，最后使用 evaluate_ndcg10.py 输出三个数据集的 Recall@10 和 NDCG@10。</w:t>
       </w:r>
     </w:p>
     <w:p>
@@ -1996,7 +2005,7 @@
           <w:rFonts w:ascii="SimSun" w:hAnsi="SimSun"/>
           <w:sz w:val="21"/>
         </w:rPr>
-        <w:t>6. 重新训练或核验</w:t>
+        <w:t>3. 可选的完整重新训练</w:t>
       </w:r>
     </w:p>
     <w:p>
@@ -2005,7 +2014,7 @@
           <w:rFonts w:ascii="SimSun" w:hAnsi="SimSun"/>
           <w:sz w:val="21"/>
         </w:rPr>
-        <w:t>模型配置位于 config/，训练入口为 run.py，排序导出脚本为 scripts/export_ranklist.py，RRF 融合脚本为 scripts/rrf_fusion.py。完整重新训练需要 CUDA 环境和较长时间；若只核验最终分数，运行第 1 步的复算命令即可。</w:t>
+        <w:t>如果需要从头重新训练，可使用 run.py。模型配置位于 config/，训练后可用 scripts/export_ranklist.py 导出排序结果，再用 scripts/rrf_fusion.py 融合。完整重训需要 CUDA 环境和较长时间；若只核验最终分数，使用第 1 或第 2 种方式即可。</w:t>
       </w:r>
     </w:p>
     <w:sectPr>

</xml_diff>

<commit_message>
Simplify final submission report
</commit_message>
<xml_diff>
--- a/report.docx
+++ b/report.docx
@@ -4,12 +4,11 @@
   <w:body>
     <w:p>
       <w:pPr>
-        <w:pStyle w:val="Title"/>
         <w:jc w:val="center"/>
       </w:pPr>
       <w:r>
         <w:rPr>
-          <w:rFonts w:ascii="Times New Roman" w:hAnsi="Times New Roman" w:eastAsia="SimSun"/>
+          <w:rFonts w:eastAsia="SimSun" w:ascii="Times New Roman" w:hAnsi="Times New Roman"/>
           <w:b/>
           <w:sz w:val="36"/>
         </w:rPr>
@@ -17,239 +16,13 @@
       </w:r>
     </w:p>
     <w:p>
-      <w:pPr>
-        <w:pStyle w:val="Heading1"/>
-      </w:pPr>
       <w:r>
         <w:rPr>
-          <w:rFonts w:ascii="Times New Roman" w:hAnsi="Times New Roman" w:eastAsia="SimSun"/>
+          <w:rFonts w:eastAsia="SimSun" w:ascii="Times New Roman" w:hAnsi="Times New Roman"/>
           <w:b/>
-          <w:sz w:val="28"/>
+          <w:sz w:val="26"/>
         </w:rPr>
-        <w:t>一、组员信息</w:t>
-      </w:r>
-    </w:p>
-    <w:tbl>
-      <w:tblPr>
-        <w:tblStyle w:val="TableGrid"/>
-        <w:tblW w:type="auto" w:w="0"/>
-        <w:tblLook w:firstColumn="1" w:firstRow="1" w:lastColumn="0" w:lastRow="0" w:noHBand="0" w:noVBand="1" w:val="04A0"/>
-      </w:tblPr>
-      <w:tblGrid>
-        <w:gridCol w:w="9648"/>
-      </w:tblGrid>
-      <w:tr>
-        <w:tc>
-          <w:tcPr>
-            <w:tcW w:type="dxa" w:w="9648"/>
-          </w:tcPr>
-          <w:p>
-            <w:r>
-              <w:t>组员</w:t>
-            </w:r>
-          </w:p>
-        </w:tc>
-      </w:tr>
-      <w:tr>
-        <w:tc>
-          <w:tcPr>
-            <w:tcW w:type="dxa" w:w="9648"/>
-          </w:tcPr>
-          <w:p>
-            <w:r>
-              <w:t>张先哲（组长）</w:t>
-            </w:r>
-          </w:p>
-        </w:tc>
-      </w:tr>
-      <w:tr>
-        <w:tc>
-          <w:tcPr>
-            <w:tcW w:type="dxa" w:w="9648"/>
-          </w:tcPr>
-          <w:p>
-            <w:r>
-              <w:t>葛洪宇</w:t>
-            </w:r>
-          </w:p>
-        </w:tc>
-      </w:tr>
-      <w:tr>
-        <w:tc>
-          <w:tcPr>
-            <w:tcW w:type="dxa" w:w="9648"/>
-          </w:tcPr>
-          <w:p>
-            <w:r>
-              <w:t>刘遥</w:t>
-            </w:r>
-          </w:p>
-        </w:tc>
-      </w:tr>
-      <w:tr>
-        <w:tc>
-          <w:tcPr>
-            <w:tcW w:type="dxa" w:w="9648"/>
-          </w:tcPr>
-          <w:p>
-            <w:r>
-              <w:t>马新洋</w:t>
-            </w:r>
-          </w:p>
-        </w:tc>
-      </w:tr>
-      <w:tr>
-        <w:tc>
-          <w:tcPr>
-            <w:tcW w:type="dxa" w:w="9648"/>
-          </w:tcPr>
-          <w:p>
-            <w:r>
-              <w:t>张晓宇</w:t>
-            </w:r>
-          </w:p>
-        </w:tc>
-      </w:tr>
-      <w:tr>
-        <w:tc>
-          <w:tcPr>
-            <w:tcW w:type="dxa" w:w="9648"/>
-          </w:tcPr>
-          <w:p>
-            <w:r>
-              <w:t>刘文琪</w:t>
-            </w:r>
-          </w:p>
-        </w:tc>
-      </w:tr>
-      <w:tr>
-        <w:tc>
-          <w:tcPr>
-            <w:tcW w:type="dxa" w:w="9648"/>
-          </w:tcPr>
-          <w:p>
-            <w:r>
-              <w:t>陈俊名</w:t>
-            </w:r>
-          </w:p>
-        </w:tc>
-      </w:tr>
-      <w:tr>
-        <w:tc>
-          <w:tcPr>
-            <w:tcW w:type="dxa" w:w="9648"/>
-          </w:tcPr>
-          <w:p>
-            <w:r>
-              <w:t>赵浩男</w:t>
-            </w:r>
-          </w:p>
-        </w:tc>
-      </w:tr>
-    </w:tbl>
-    <w:p/>
-    <w:p>
-      <w:pPr>
-        <w:pStyle w:val="Heading1"/>
-      </w:pPr>
-      <w:r>
-        <w:rPr>
-          <w:rFonts w:ascii="Times New Roman" w:hAnsi="Times New Roman" w:eastAsia="SimSun"/>
-          <w:b/>
-          <w:sz w:val="28"/>
-        </w:rPr>
-        <w:t>二、任务与数据</w:t>
-      </w:r>
-    </w:p>
-    <w:p>
-      <w:pPr>
-        <w:spacing w:line="276" w:lineRule="auto"/>
-        <w:ind w:firstLine="440"/>
-      </w:pPr>
-      <w:r>
-        <w:rPr>
-          <w:rFonts w:ascii="Times New Roman" w:hAnsi="Times New Roman" w:eastAsia="SimSun"/>
-          <w:sz w:val="22"/>
-        </w:rPr>
-        <w:t>本次任务是 Amazon Reviews 2023 三个 5-core 类别上的 Top-K 商品推荐。实验使用 Industrial_and_Scientific、Musical_Instruments 和 CDs_and_Vinyl 三个数据集。</w:t>
-      </w:r>
-    </w:p>
-    <w:p>
-      <w:pPr>
-        <w:spacing w:line="276" w:lineRule="auto"/>
-        <w:ind w:firstLine="440"/>
-      </w:pPr>
-      <w:r>
-        <w:rPr>
-          <w:rFonts w:ascii="Times New Roman" w:hAnsi="Times New Roman" w:eastAsia="SimSun"/>
-          <w:sz w:val="22"/>
-        </w:rPr>
-        <w:t>划分方式按作业说明执行：每个用户前 N-2 个交互用于训练，第 N-1 个交互用于验证，第 N 个交互用于测试。模型根据用户历史交互预测测试集中目标商品，主要评价指标为测试集 NDCG@10。</w:t>
-      </w:r>
-    </w:p>
-    <w:p>
-      <w:pPr>
-        <w:pStyle w:val="Heading1"/>
-      </w:pPr>
-      <w:r>
-        <w:rPr>
-          <w:rFonts w:ascii="Times New Roman" w:hAnsi="Times New Roman" w:eastAsia="SimSun"/>
-          <w:b/>
-          <w:sz w:val="28"/>
-        </w:rPr>
-        <w:t>三、方法</w:t>
-      </w:r>
-    </w:p>
-    <w:p>
-      <w:pPr>
-        <w:spacing w:line="276" w:lineRule="auto"/>
-        <w:ind w:firstLine="440"/>
-      </w:pPr>
-      <w:r>
-        <w:rPr>
-          <w:rFonts w:ascii="Times New Roman" w:hAnsi="Times New Roman" w:eastAsia="SimSun"/>
-          <w:sz w:val="22"/>
-        </w:rPr>
-        <w:t>原始代码中 UniSRec 的结果优于 SASRecText，因此本实验以 UniSRec 作为主要基线。优化时保留原有文本序列推荐思路，同时补充了 SASRec、GRU4Rec、NARM 等纯序列模型。</w:t>
-      </w:r>
-    </w:p>
-    <w:p>
-      <w:pPr>
-        <w:spacing w:line="276" w:lineRule="auto"/>
-        <w:ind w:firstLine="440"/>
-      </w:pPr>
-      <w:r>
-        <w:rPr>
-          <w:rFonts w:ascii="Times New Roman" w:hAnsi="Times New Roman" w:eastAsia="SimSun"/>
-          <w:sz w:val="22"/>
-        </w:rPr>
-        <w:t>商品侧特征方面，除 title、features、categories、description 外，进一步使用 main category、store、details、price、average rating、rating number 和 rank 等 metadata。用户侧特征方面，在 item 序列之外加入历史评分、时间间隔和 recency。</w:t>
-      </w:r>
-    </w:p>
-    <w:p>
-      <w:pPr>
-        <w:spacing w:line="276" w:lineRule="auto"/>
-        <w:ind w:firstLine="440"/>
-      </w:pPr>
-      <w:r>
-        <w:rPr>
-          <w:rFonts w:ascii="Times New Roman" w:hAnsi="Times New Roman" w:eastAsia="SimSun"/>
-          <w:sz w:val="22"/>
-        </w:rPr>
-        <w:t>在此基础上实现 RichUniSRec，将商品文本向量、可训练 item ID embedding、结构化商品特征、用户历史评分和时间特征进行融合。最后使用 RRF 对多个模型的 Top-10 排序结果进行融合，得到最终推荐列表。</w:t>
-      </w:r>
-    </w:p>
-    <w:p>
-      <w:pPr>
-        <w:pStyle w:val="Heading1"/>
-      </w:pPr>
-      <w:r>
-        <w:rPr>
-          <w:rFonts w:ascii="Times New Roman" w:hAnsi="Times New Roman" w:eastAsia="SimSun"/>
-          <w:b/>
-          <w:sz w:val="28"/>
-        </w:rPr>
-        <w:t>四、主要参数</w:t>
+        <w:t>一、组员</w:t>
       </w:r>
     </w:p>
     <w:tbl>
@@ -260,57 +33,12 @@
         <w:tblLook w:firstColumn="1" w:firstRow="1" w:lastColumn="0" w:lastRow="0" w:noHBand="0" w:noVBand="1" w:val="04A0"/>
       </w:tblPr>
       <w:tblGrid>
-        <w:gridCol w:w="4824"/>
-        <w:gridCol w:w="4824"/>
+        <w:gridCol w:w="9648"/>
       </w:tblGrid>
       <w:tr>
         <w:tc>
           <w:tcPr>
-            <w:tcW w:type="dxa" w:w="4824"/>
-            <w:vAlign w:val="center"/>
-            <w:shd w:fill="D9EAF7"/>
-          </w:tcPr>
-          <w:p>
-            <w:pPr>
-              <w:jc w:val="center"/>
-            </w:pPr>
-            <w:r/>
-            <w:r>
-              <w:rPr>
-                <w:rFonts w:ascii="Times New Roman" w:hAnsi="Times New Roman" w:eastAsia="SimSun"/>
-                <w:b/>
-                <w:sz w:val="21"/>
-              </w:rPr>
-              <w:t>项目</w:t>
-            </w:r>
-          </w:p>
-        </w:tc>
-        <w:tc>
-          <w:tcPr>
-            <w:tcW w:type="dxa" w:w="4824"/>
-            <w:vAlign w:val="center"/>
-            <w:shd w:fill="D9EAF7"/>
-          </w:tcPr>
-          <w:p>
-            <w:pPr>
-              <w:jc w:val="center"/>
-            </w:pPr>
-            <w:r/>
-            <w:r>
-              <w:rPr>
-                <w:rFonts w:ascii="Times New Roman" w:hAnsi="Times New Roman" w:eastAsia="SimSun"/>
-                <w:b/>
-                <w:sz w:val="21"/>
-              </w:rPr>
-              <w:t>设置</w:t>
-            </w:r>
-          </w:p>
-        </w:tc>
-      </w:tr>
-      <w:tr>
-        <w:tc>
-          <w:tcPr>
-            <w:tcW w:type="dxa" w:w="4824"/>
+            <w:tcW w:type="dxa" w:w="9648"/>
             <w:vAlign w:val="center"/>
           </w:tcPr>
           <w:p>
@@ -320,17 +48,19 @@
             <w:r/>
             <w:r>
               <w:rPr>
-                <w:rFonts w:ascii="Times New Roman" w:hAnsi="Times New Roman" w:eastAsia="SimSun"/>
-                <w:b w:val="0"/>
+                <w:rFonts w:eastAsia="SimSun" w:ascii="Times New Roman" w:hAnsi="Times New Roman"/>
+                <w:b/>
                 <w:sz w:val="21"/>
               </w:rPr>
-              <w:t>框架</w:t>
+              <w:t>组员</w:t>
             </w:r>
           </w:p>
         </w:tc>
+      </w:tr>
+      <w:tr>
         <w:tc>
           <w:tcPr>
-            <w:tcW w:type="dxa" w:w="4824"/>
+            <w:tcW w:type="dxa" w:w="9648"/>
             <w:vAlign w:val="center"/>
           </w:tcPr>
           <w:p>
@@ -340,11 +70,11 @@
             <w:r/>
             <w:r>
               <w:rPr>
-                <w:rFonts w:ascii="Times New Roman" w:hAnsi="Times New Roman" w:eastAsia="SimSun"/>
+                <w:rFonts w:eastAsia="SimSun" w:ascii="Times New Roman" w:hAnsi="Times New Roman"/>
                 <w:b w:val="0"/>
                 <w:sz w:val="21"/>
               </w:rPr>
-              <w:t>RecBole 1.2.1, PyTorch 2.1.x</w:t>
+              <w:t>张先哲（组长）</w:t>
             </w:r>
           </w:p>
         </w:tc>
@@ -352,7 +82,7 @@
       <w:tr>
         <w:tc>
           <w:tcPr>
-            <w:tcW w:type="dxa" w:w="4824"/>
+            <w:tcW w:type="dxa" w:w="9648"/>
             <w:vAlign w:val="center"/>
           </w:tcPr>
           <w:p>
@@ -362,17 +92,19 @@
             <w:r/>
             <w:r>
               <w:rPr>
-                <w:rFonts w:ascii="Times New Roman" w:hAnsi="Times New Roman" w:eastAsia="SimSun"/>
+                <w:rFonts w:eastAsia="SimSun" w:ascii="Times New Roman" w:hAnsi="Times New Roman"/>
                 <w:b w:val="0"/>
                 <w:sz w:val="21"/>
               </w:rPr>
-              <w:t>GPU</w:t>
+              <w:t>葛洪宇</w:t>
             </w:r>
           </w:p>
         </w:tc>
+      </w:tr>
+      <w:tr>
         <w:tc>
           <w:tcPr>
-            <w:tcW w:type="dxa" w:w="4824"/>
+            <w:tcW w:type="dxa" w:w="9648"/>
             <w:vAlign w:val="center"/>
           </w:tcPr>
           <w:p>
@@ -382,11 +114,11 @@
             <w:r/>
             <w:r>
               <w:rPr>
-                <w:rFonts w:ascii="Times New Roman" w:hAnsi="Times New Roman" w:eastAsia="SimSun"/>
+                <w:rFonts w:eastAsia="SimSun" w:ascii="Times New Roman" w:hAnsi="Times New Roman"/>
                 <w:b w:val="0"/>
                 <w:sz w:val="21"/>
               </w:rPr>
-              <w:t>RTX 4090 / 4090D</w:t>
+              <w:t>刘遥</w:t>
             </w:r>
           </w:p>
         </w:tc>
@@ -394,7 +126,7 @@
       <w:tr>
         <w:tc>
           <w:tcPr>
-            <w:tcW w:type="dxa" w:w="4824"/>
+            <w:tcW w:type="dxa" w:w="9648"/>
             <w:vAlign w:val="center"/>
           </w:tcPr>
           <w:p>
@@ -404,17 +136,19 @@
             <w:r/>
             <w:r>
               <w:rPr>
-                <w:rFonts w:ascii="Times New Roman" w:hAnsi="Times New Roman" w:eastAsia="SimSun"/>
+                <w:rFonts w:eastAsia="SimSun" w:ascii="Times New Roman" w:hAnsi="Times New Roman"/>
                 <w:b w:val="0"/>
                 <w:sz w:val="21"/>
               </w:rPr>
-              <w:t>评价指标</w:t>
+              <w:t>马新洋</w:t>
             </w:r>
           </w:p>
         </w:tc>
+      </w:tr>
+      <w:tr>
         <w:tc>
           <w:tcPr>
-            <w:tcW w:type="dxa" w:w="4824"/>
+            <w:tcW w:type="dxa" w:w="9648"/>
             <w:vAlign w:val="center"/>
           </w:tcPr>
           <w:p>
@@ -424,11 +158,11 @@
             <w:r/>
             <w:r>
               <w:rPr>
-                <w:rFonts w:ascii="Times New Roman" w:hAnsi="Times New Roman" w:eastAsia="SimSun"/>
+                <w:rFonts w:eastAsia="SimSun" w:ascii="Times New Roman" w:hAnsi="Times New Roman"/>
                 <w:b w:val="0"/>
                 <w:sz w:val="21"/>
               </w:rPr>
-              <w:t>Recall@10/50, NDCG@10/50</w:t>
+              <w:t>张晓宇</w:t>
             </w:r>
           </w:p>
         </w:tc>
@@ -436,7 +170,7 @@
       <w:tr>
         <w:tc>
           <w:tcPr>
-            <w:tcW w:type="dxa" w:w="4824"/>
+            <w:tcW w:type="dxa" w:w="9648"/>
             <w:vAlign w:val="center"/>
           </w:tcPr>
           <w:p>
@@ -446,17 +180,19 @@
             <w:r/>
             <w:r>
               <w:rPr>
-                <w:rFonts w:ascii="Times New Roman" w:hAnsi="Times New Roman" w:eastAsia="SimSun"/>
+                <w:rFonts w:eastAsia="SimSun" w:ascii="Times New Roman" w:hAnsi="Times New Roman"/>
                 <w:b w:val="0"/>
                 <w:sz w:val="21"/>
               </w:rPr>
-              <w:t>主指标</w:t>
+              <w:t>刘文琪</w:t>
             </w:r>
           </w:p>
         </w:tc>
+      </w:tr>
+      <w:tr>
         <w:tc>
           <w:tcPr>
-            <w:tcW w:type="dxa" w:w="4824"/>
+            <w:tcW w:type="dxa" w:w="9648"/>
             <w:vAlign w:val="center"/>
           </w:tcPr>
           <w:p>
@@ -466,11 +202,11 @@
             <w:r/>
             <w:r>
               <w:rPr>
-                <w:rFonts w:ascii="Times New Roman" w:hAnsi="Times New Roman" w:eastAsia="SimSun"/>
+                <w:rFonts w:eastAsia="SimSun" w:ascii="Times New Roman" w:hAnsi="Times New Roman"/>
                 <w:b w:val="0"/>
                 <w:sz w:val="21"/>
               </w:rPr>
-              <w:t>NDCG@10</w:t>
+              <w:t>陈俊名</w:t>
             </w:r>
           </w:p>
         </w:tc>
@@ -478,7 +214,7 @@
       <w:tr>
         <w:tc>
           <w:tcPr>
-            <w:tcW w:type="dxa" w:w="4824"/>
+            <w:tcW w:type="dxa" w:w="9648"/>
             <w:vAlign w:val="center"/>
           </w:tcPr>
           <w:p>
@@ -488,216 +224,80 @@
             <w:r/>
             <w:r>
               <w:rPr>
-                <w:rFonts w:ascii="Times New Roman" w:hAnsi="Times New Roman" w:eastAsia="SimSun"/>
+                <w:rFonts w:eastAsia="SimSun" w:ascii="Times New Roman" w:hAnsi="Times New Roman"/>
                 <w:b w:val="0"/>
                 <w:sz w:val="21"/>
               </w:rPr>
-              <w:t>early stopping</w:t>
-            </w:r>
-          </w:p>
-        </w:tc>
-        <w:tc>
-          <w:tcPr>
-            <w:tcW w:type="dxa" w:w="4824"/>
-            <w:vAlign w:val="center"/>
-          </w:tcPr>
-          <w:p>
-            <w:pPr>
-              <w:jc w:val="center"/>
-            </w:pPr>
-            <w:r/>
-            <w:r>
-              <w:rPr>
-                <w:rFonts w:ascii="Times New Roman" w:hAnsi="Times New Roman" w:eastAsia="SimSun"/>
-                <w:b w:val="0"/>
-                <w:sz w:val="21"/>
-              </w:rPr>
-              <w:t>dev set NDCG@10, stopping_step=10</w:t>
-            </w:r>
-          </w:p>
-        </w:tc>
-      </w:tr>
-      <w:tr>
-        <w:tc>
-          <w:tcPr>
-            <w:tcW w:type="dxa" w:w="4824"/>
-            <w:vAlign w:val="center"/>
-          </w:tcPr>
-          <w:p>
-            <w:pPr>
-              <w:jc w:val="center"/>
-            </w:pPr>
-            <w:r/>
-            <w:r>
-              <w:rPr>
-                <w:rFonts w:ascii="Times New Roman" w:hAnsi="Times New Roman" w:eastAsia="SimSun"/>
-                <w:b w:val="0"/>
-                <w:sz w:val="21"/>
-              </w:rPr>
-              <w:t>SASRec</w:t>
-            </w:r>
-          </w:p>
-        </w:tc>
-        <w:tc>
-          <w:tcPr>
-            <w:tcW w:type="dxa" w:w="4824"/>
-            <w:vAlign w:val="center"/>
-          </w:tcPr>
-          <w:p>
-            <w:pPr>
-              <w:jc w:val="center"/>
-            </w:pPr>
-            <w:r/>
-            <w:r>
-              <w:rPr>
-                <w:rFonts w:ascii="Times New Roman" w:hAnsi="Times New Roman" w:eastAsia="SimSun"/>
-                <w:b w:val="0"/>
-                <w:sz w:val="21"/>
-              </w:rPr>
-              <w:t>hidden_size=300, n_layers=3, n_heads=4, lr=0.001, dropout=0.3</w:t>
-            </w:r>
-          </w:p>
-        </w:tc>
-      </w:tr>
-      <w:tr>
-        <w:tc>
-          <w:tcPr>
-            <w:tcW w:type="dxa" w:w="4824"/>
-            <w:vAlign w:val="center"/>
-          </w:tcPr>
-          <w:p>
-            <w:pPr>
-              <w:jc w:val="center"/>
-            </w:pPr>
-            <w:r/>
-            <w:r>
-              <w:rPr>
-                <w:rFonts w:ascii="Times New Roman" w:hAnsi="Times New Roman" w:eastAsia="SimSun"/>
-                <w:b w:val="0"/>
-                <w:sz w:val="21"/>
-              </w:rPr>
-              <w:t>GRU4Rec</w:t>
-            </w:r>
-          </w:p>
-        </w:tc>
-        <w:tc>
-          <w:tcPr>
-            <w:tcW w:type="dxa" w:w="4824"/>
-            <w:vAlign w:val="center"/>
-          </w:tcPr>
-          <w:p>
-            <w:pPr>
-              <w:jc w:val="center"/>
-            </w:pPr>
-            <w:r/>
-            <w:r>
-              <w:rPr>
-                <w:rFonts w:ascii="Times New Roman" w:hAnsi="Times New Roman" w:eastAsia="SimSun"/>
-                <w:b w:val="0"/>
-                <w:sz w:val="21"/>
-              </w:rPr>
-              <w:t>embedding_size=300, hidden_size=300, lr=0.001, dropout=0.2</w:t>
-            </w:r>
-          </w:p>
-        </w:tc>
-      </w:tr>
-      <w:tr>
-        <w:tc>
-          <w:tcPr>
-            <w:tcW w:type="dxa" w:w="4824"/>
-            <w:vAlign w:val="center"/>
-          </w:tcPr>
-          <w:p>
-            <w:pPr>
-              <w:jc w:val="center"/>
-            </w:pPr>
-            <w:r/>
-            <w:r>
-              <w:rPr>
-                <w:rFonts w:ascii="Times New Roman" w:hAnsi="Times New Roman" w:eastAsia="SimSun"/>
-                <w:b w:val="0"/>
-                <w:sz w:val="21"/>
-              </w:rPr>
-              <w:t>NARM</w:t>
-            </w:r>
-          </w:p>
-        </w:tc>
-        <w:tc>
-          <w:tcPr>
-            <w:tcW w:type="dxa" w:w="4824"/>
-            <w:vAlign w:val="center"/>
-          </w:tcPr>
-          <w:p>
-            <w:pPr>
-              <w:jc w:val="center"/>
-            </w:pPr>
-            <w:r/>
-            <w:r>
-              <w:rPr>
-                <w:rFonts w:ascii="Times New Roman" w:hAnsi="Times New Roman" w:eastAsia="SimSun"/>
-                <w:b w:val="0"/>
-                <w:sz w:val="21"/>
-              </w:rPr>
-              <w:t>embedding_size=300, hidden_size=300, lr=0.001, dropout=[0.25,0.5]</w:t>
-            </w:r>
-          </w:p>
-        </w:tc>
-      </w:tr>
-      <w:tr>
-        <w:tc>
-          <w:tcPr>
-            <w:tcW w:type="dxa" w:w="4824"/>
-            <w:vAlign w:val="center"/>
-          </w:tcPr>
-          <w:p>
-            <w:pPr>
-              <w:jc w:val="center"/>
-            </w:pPr>
-            <w:r/>
-            <w:r>
-              <w:rPr>
-                <w:rFonts w:ascii="Times New Roman" w:hAnsi="Times New Roman" w:eastAsia="SimSun"/>
-                <w:b w:val="0"/>
-                <w:sz w:val="21"/>
-              </w:rPr>
-              <w:t>RichUniSRec</w:t>
-            </w:r>
-          </w:p>
-        </w:tc>
-        <w:tc>
-          <w:tcPr>
-            <w:tcW w:type="dxa" w:w="4824"/>
-            <w:vAlign w:val="center"/>
-          </w:tcPr>
-          <w:p>
-            <w:pPr>
-              <w:jc w:val="center"/>
-            </w:pPr>
-            <w:r/>
-            <w:r>
-              <w:rPr>
-                <w:rFonts w:ascii="Times New Roman" w:hAnsi="Times New Roman" w:eastAsia="SimSun"/>
-                <w:b w:val="0"/>
-                <w:sz w:val="21"/>
-              </w:rPr>
-              <w:t>hidden_size=300, n_layers=3, n_heads=4, lr=0.0001, temperature=0.05</w:t>
+              <w:t>赵浩男</w:t>
             </w:r>
           </w:p>
         </w:tc>
       </w:tr>
     </w:tbl>
-    <w:p/>
     <w:p>
-      <w:pPr>
-        <w:pStyle w:val="Heading1"/>
-      </w:pPr>
       <w:r>
         <w:rPr>
-          <w:rFonts w:ascii="Times New Roman" w:hAnsi="Times New Roman" w:eastAsia="SimSun"/>
+          <w:rFonts w:eastAsia="SimSun" w:ascii="Times New Roman" w:hAnsi="Times New Roman"/>
           <w:b/>
-          <w:sz w:val="28"/>
+          <w:sz w:val="26"/>
         </w:rPr>
-        <w:t>五、实验结果</w:t>
+        <w:t>二、任务说明</w:t>
+      </w:r>
+    </w:p>
+    <w:p>
+      <w:r>
+        <w:rPr>
+          <w:rFonts w:eastAsia="SimSun" w:ascii="Times New Roman" w:hAnsi="Times New Roman"/>
+          <w:sz w:val="22"/>
+        </w:rPr>
+        <w:t>本次作业使用 Amazon Reviews 2023 的 5-Core 数据，在 Industrial_and_Scientific、Musical_Instruments 和 CDs_and_Vinyl 三个类别上进行 Top-K 商品推荐实验。</w:t>
+      </w:r>
+    </w:p>
+    <w:p>
+      <w:r>
+        <w:rPr>
+          <w:rFonts w:eastAsia="SimSun" w:ascii="Times New Roman" w:hAnsi="Times New Roman"/>
+          <w:sz w:val="22"/>
+        </w:rPr>
+        <w:t>数据划分按作业要求进行：对每个用户按交互时间排序，前 N-2 个交互用于训练，第 N-1 个交互用于验证，第 N 个交互用于测试。</w:t>
+      </w:r>
+    </w:p>
+    <w:p>
+      <w:r>
+        <w:rPr>
+          <w:rFonts w:eastAsia="SimSun" w:ascii="Times New Roman" w:hAnsi="Times New Roman"/>
+          <w:sz w:val="22"/>
+        </w:rPr>
+        <w:t>评价指标使用 Recall@10 和 NDCG@10，其中作业主要关注 NDCG@10。</w:t>
+      </w:r>
+    </w:p>
+    <w:p>
+      <w:r>
+        <w:rPr>
+          <w:rFonts w:eastAsia="SimSun" w:ascii="Times New Roman" w:hAnsi="Times New Roman"/>
+          <w:b/>
+          <w:sz w:val="26"/>
+        </w:rPr>
+        <w:t>三、方法说明</w:t>
+      </w:r>
+    </w:p>
+    <w:p>
+      <w:r>
+        <w:rPr>
+          <w:rFonts w:eastAsia="SimSun" w:ascii="Times New Roman" w:hAnsi="Times New Roman"/>
+          <w:sz w:val="22"/>
+        </w:rPr>
+        <w:t>模型根据用户历史交互序列进行商品排序，同时使用商品标题、类别、属性、描述、价格和评分等 metadata，并加入用户历史评分、时间间隔和近期性信息。最终为每个用户输出 Top-10 推荐列表。</w:t>
+      </w:r>
+    </w:p>
+    <w:p>
+      <w:r>
+        <w:rPr>
+          <w:rFonts w:eastAsia="SimSun" w:ascii="Times New Roman" w:hAnsi="Times New Roman"/>
+          <w:b/>
+          <w:sz w:val="26"/>
+        </w:rPr>
+        <w:t>四、实验结果</w:t>
       </w:r>
     </w:p>
     <w:tbl>
@@ -718,7 +318,6 @@
           <w:tcPr>
             <w:tcW w:type="dxa" w:w="2412"/>
             <w:vAlign w:val="center"/>
-            <w:shd w:fill="D9EAF7"/>
           </w:tcPr>
           <w:p>
             <w:pPr>
@@ -727,7 +326,7 @@
             <w:r/>
             <w:r>
               <w:rPr>
-                <w:rFonts w:ascii="Times New Roman" w:hAnsi="Times New Roman" w:eastAsia="SimSun"/>
+                <w:rFonts w:eastAsia="SimSun" w:ascii="Times New Roman" w:hAnsi="Times New Roman"/>
                 <w:b/>
                 <w:sz w:val="21"/>
               </w:rPr>
@@ -739,7 +338,6 @@
           <w:tcPr>
             <w:tcW w:type="dxa" w:w="2412"/>
             <w:vAlign w:val="center"/>
-            <w:shd w:fill="D9EAF7"/>
           </w:tcPr>
           <w:p>
             <w:pPr>
@@ -748,11 +346,11 @@
             <w:r/>
             <w:r>
               <w:rPr>
-                <w:rFonts w:ascii="Times New Roman" w:hAnsi="Times New Roman" w:eastAsia="SimSun"/>
+                <w:rFonts w:eastAsia="SimSun" w:ascii="Times New Roman" w:hAnsi="Times New Roman"/>
                 <w:b/>
                 <w:sz w:val="21"/>
               </w:rPr>
-              <w:t>最终方法</w:t>
+              <w:t>测试样本数</w:t>
             </w:r>
           </w:p>
         </w:tc>
@@ -760,7 +358,6 @@
           <w:tcPr>
             <w:tcW w:type="dxa" w:w="2412"/>
             <w:vAlign w:val="center"/>
-            <w:shd w:fill="D9EAF7"/>
           </w:tcPr>
           <w:p>
             <w:pPr>
@@ -769,7 +366,7 @@
             <w:r/>
             <w:r>
               <w:rPr>
-                <w:rFonts w:ascii="Times New Roman" w:hAnsi="Times New Roman" w:eastAsia="SimSun"/>
+                <w:rFonts w:eastAsia="SimSun" w:ascii="Times New Roman" w:hAnsi="Times New Roman"/>
                 <w:b/>
                 <w:sz w:val="21"/>
               </w:rPr>
@@ -781,7 +378,6 @@
           <w:tcPr>
             <w:tcW w:type="dxa" w:w="2412"/>
             <w:vAlign w:val="center"/>
-            <w:shd w:fill="D9EAF7"/>
           </w:tcPr>
           <w:p>
             <w:pPr>
@@ -790,7 +386,7 @@
             <w:r/>
             <w:r>
               <w:rPr>
-                <w:rFonts w:ascii="Times New Roman" w:hAnsi="Times New Roman" w:eastAsia="SimSun"/>
+                <w:rFonts w:eastAsia="SimSun" w:ascii="Times New Roman" w:hAnsi="Times New Roman"/>
                 <w:b/>
                 <w:sz w:val="21"/>
               </w:rPr>
@@ -812,7 +408,7 @@
             <w:r/>
             <w:r>
               <w:rPr>
-                <w:rFonts w:ascii="Times New Roman" w:hAnsi="Times New Roman" w:eastAsia="SimSun"/>
+                <w:rFonts w:eastAsia="SimSun" w:ascii="Times New Roman" w:hAnsi="Times New Roman"/>
                 <w:b w:val="0"/>
                 <w:sz w:val="21"/>
               </w:rPr>
@@ -832,11 +428,11 @@
             <w:r/>
             <w:r>
               <w:rPr>
-                <w:rFonts w:ascii="Times New Roman" w:hAnsi="Times New Roman" w:eastAsia="SimSun"/>
+                <w:rFonts w:eastAsia="SimSun" w:ascii="Times New Roman" w:hAnsi="Times New Roman"/>
                 <w:b w:val="0"/>
                 <w:sz w:val="21"/>
               </w:rPr>
-              <w:t>RRF(UniSRec+SASRec+GRU4Rec+NARM+RichUniSRec)</w:t>
+              <w:t>57439</w:t>
             </w:r>
           </w:p>
         </w:tc>
@@ -852,7 +448,7 @@
             <w:r/>
             <w:r>
               <w:rPr>
-                <w:rFonts w:ascii="Times New Roman" w:hAnsi="Times New Roman" w:eastAsia="SimSun"/>
+                <w:rFonts w:eastAsia="SimSun" w:ascii="Times New Roman" w:hAnsi="Times New Roman"/>
                 <w:b w:val="0"/>
                 <w:sz w:val="21"/>
               </w:rPr>
@@ -872,7 +468,7 @@
             <w:r/>
             <w:r>
               <w:rPr>
-                <w:rFonts w:ascii="Times New Roman" w:hAnsi="Times New Roman" w:eastAsia="SimSun"/>
+                <w:rFonts w:eastAsia="SimSun" w:ascii="Times New Roman" w:hAnsi="Times New Roman"/>
                 <w:b w:val="0"/>
                 <w:sz w:val="21"/>
               </w:rPr>
@@ -894,7 +490,7 @@
             <w:r/>
             <w:r>
               <w:rPr>
-                <w:rFonts w:ascii="Times New Roman" w:hAnsi="Times New Roman" w:eastAsia="SimSun"/>
+                <w:rFonts w:eastAsia="SimSun" w:ascii="Times New Roman" w:hAnsi="Times New Roman"/>
                 <w:b w:val="0"/>
                 <w:sz w:val="21"/>
               </w:rPr>
@@ -914,11 +510,11 @@
             <w:r/>
             <w:r>
               <w:rPr>
-                <w:rFonts w:ascii="Times New Roman" w:hAnsi="Times New Roman" w:eastAsia="SimSun"/>
+                <w:rFonts w:eastAsia="SimSun" w:ascii="Times New Roman" w:hAnsi="Times New Roman"/>
                 <w:b w:val="0"/>
                 <w:sz w:val="21"/>
               </w:rPr>
-              <w:t>RRF(UniSRec+SASRec+GRU4Rec+NARM+RichUniSRec)</w:t>
+              <w:t>50985</w:t>
             </w:r>
           </w:p>
         </w:tc>
@@ -934,7 +530,7 @@
             <w:r/>
             <w:r>
               <w:rPr>
-                <w:rFonts w:ascii="Times New Roman" w:hAnsi="Times New Roman" w:eastAsia="SimSun"/>
+                <w:rFonts w:eastAsia="SimSun" w:ascii="Times New Roman" w:hAnsi="Times New Roman"/>
                 <w:b w:val="0"/>
                 <w:sz w:val="21"/>
               </w:rPr>
@@ -954,7 +550,7 @@
             <w:r/>
             <w:r>
               <w:rPr>
-                <w:rFonts w:ascii="Times New Roman" w:hAnsi="Times New Roman" w:eastAsia="SimSun"/>
+                <w:rFonts w:eastAsia="SimSun" w:ascii="Times New Roman" w:hAnsi="Times New Roman"/>
                 <w:b w:val="0"/>
                 <w:sz w:val="21"/>
               </w:rPr>
@@ -976,7 +572,7 @@
             <w:r/>
             <w:r>
               <w:rPr>
-                <w:rFonts w:ascii="Times New Roman" w:hAnsi="Times New Roman" w:eastAsia="SimSun"/>
+                <w:rFonts w:eastAsia="SimSun" w:ascii="Times New Roman" w:hAnsi="Times New Roman"/>
                 <w:b w:val="0"/>
                 <w:sz w:val="21"/>
               </w:rPr>
@@ -996,11 +592,11 @@
             <w:r/>
             <w:r>
               <w:rPr>
-                <w:rFonts w:ascii="Times New Roman" w:hAnsi="Times New Roman" w:eastAsia="SimSun"/>
+                <w:rFonts w:eastAsia="SimSun" w:ascii="Times New Roman" w:hAnsi="Times New Roman"/>
                 <w:b w:val="0"/>
                 <w:sz w:val="21"/>
               </w:rPr>
-              <w:t>RRF(RichUniSRec+SASRec+GRU4Rec+NARM)</w:t>
+              <w:t>123876</w:t>
             </w:r>
           </w:p>
         </w:tc>
@@ -1016,7 +612,7 @@
             <w:r/>
             <w:r>
               <w:rPr>
-                <w:rFonts w:ascii="Times New Roman" w:hAnsi="Times New Roman" w:eastAsia="SimSun"/>
+                <w:rFonts w:eastAsia="SimSun" w:ascii="Times New Roman" w:hAnsi="Times New Roman"/>
                 <w:b w:val="0"/>
                 <w:sz w:val="21"/>
               </w:rPr>
@@ -1036,7 +632,7 @@
             <w:r/>
             <w:r>
               <w:rPr>
-                <w:rFonts w:ascii="Times New Roman" w:hAnsi="Times New Roman" w:eastAsia="SimSun"/>
+                <w:rFonts w:eastAsia="SimSun" w:ascii="Times New Roman" w:hAnsi="Times New Roman"/>
                 <w:b w:val="0"/>
                 <w:sz w:val="21"/>
               </w:rPr>
@@ -1058,11 +654,11 @@
             <w:r/>
             <w:r>
               <w:rPr>
-                <w:rFonts w:ascii="Times New Roman" w:hAnsi="Times New Roman" w:eastAsia="SimSun"/>
+                <w:rFonts w:eastAsia="SimSun" w:ascii="Times New Roman" w:hAnsi="Times New Roman"/>
                 <w:b w:val="0"/>
                 <w:sz w:val="21"/>
               </w:rPr>
-              <w:t>等权平均</w:t>
+              <w:t>Macro Average</w:t>
             </w:r>
           </w:p>
         </w:tc>
@@ -1078,11 +674,11 @@
             <w:r/>
             <w:r>
               <w:rPr>
-                <w:rFonts w:ascii="Times New Roman" w:hAnsi="Times New Roman" w:eastAsia="SimSun"/>
+                <w:rFonts w:eastAsia="SimSun" w:ascii="Times New Roman" w:hAnsi="Times New Roman"/>
                 <w:b w:val="0"/>
                 <w:sz w:val="21"/>
               </w:rPr>
-              <w:t>-</w:t>
+              <w:t>232300</w:t>
             </w:r>
           </w:p>
         </w:tc>
@@ -1098,7 +694,7 @@
             <w:r/>
             <w:r>
               <w:rPr>
-                <w:rFonts w:ascii="Times New Roman" w:hAnsi="Times New Roman" w:eastAsia="SimSun"/>
+                <w:rFonts w:eastAsia="SimSun" w:ascii="Times New Roman" w:hAnsi="Times New Roman"/>
                 <w:b w:val="0"/>
                 <w:sz w:val="21"/>
               </w:rPr>
@@ -1118,7 +714,7 @@
             <w:r/>
             <w:r>
               <w:rPr>
-                <w:rFonts w:ascii="Times New Roman" w:hAnsi="Times New Roman" w:eastAsia="SimSun"/>
+                <w:rFonts w:eastAsia="SimSun" w:ascii="Times New Roman" w:hAnsi="Times New Roman"/>
                 <w:b w:val="0"/>
                 <w:sz w:val="21"/>
               </w:rPr>
@@ -1127,133 +723,10 @@
           </w:p>
         </w:tc>
       </w:tr>
-    </w:tbl>
-    <w:p/>
-    <w:tbl>
-      <w:tblPr>
-        <w:tblStyle w:val="TableGrid"/>
-        <w:tblW w:type="auto" w:w="0"/>
-        <w:jc w:val="center"/>
-        <w:tblLook w:firstColumn="1" w:firstRow="1" w:lastColumn="0" w:lastRow="0" w:noHBand="0" w:noVBand="1" w:val="04A0"/>
-      </w:tblPr>
-      <w:tblGrid>
-        <w:gridCol w:w="1930"/>
-        <w:gridCol w:w="1930"/>
-        <w:gridCol w:w="1930"/>
-        <w:gridCol w:w="1930"/>
-        <w:gridCol w:w="1930"/>
-      </w:tblGrid>
       <w:tr>
         <w:tc>
           <w:tcPr>
-            <w:tcW w:type="dxa" w:w="1930"/>
-            <w:vAlign w:val="center"/>
-            <w:shd w:fill="D9EAF7"/>
-          </w:tcPr>
-          <w:p>
-            <w:pPr>
-              <w:jc w:val="center"/>
-            </w:pPr>
-            <w:r/>
-            <w:r>
-              <w:rPr>
-                <w:rFonts w:ascii="Times New Roman" w:hAnsi="Times New Roman" w:eastAsia="SimSun"/>
-                <w:b/>
-                <w:sz w:val="21"/>
-              </w:rPr>
-              <w:t>数据集</w:t>
-            </w:r>
-          </w:p>
-        </w:tc>
-        <w:tc>
-          <w:tcPr>
-            <w:tcW w:type="dxa" w:w="1930"/>
-            <w:vAlign w:val="center"/>
-            <w:shd w:fill="D9EAF7"/>
-          </w:tcPr>
-          <w:p>
-            <w:pPr>
-              <w:jc w:val="center"/>
-            </w:pPr>
-            <w:r/>
-            <w:r>
-              <w:rPr>
-                <w:rFonts w:ascii="Times New Roman" w:hAnsi="Times New Roman" w:eastAsia="SimSun"/>
-                <w:b/>
-                <w:sz w:val="21"/>
-              </w:rPr>
-              <w:t>原始 UniSRec NDCG@10</w:t>
-            </w:r>
-          </w:p>
-        </w:tc>
-        <w:tc>
-          <w:tcPr>
-            <w:tcW w:type="dxa" w:w="1930"/>
-            <w:vAlign w:val="center"/>
-            <w:shd w:fill="D9EAF7"/>
-          </w:tcPr>
-          <w:p>
-            <w:pPr>
-              <w:jc w:val="center"/>
-            </w:pPr>
-            <w:r/>
-            <w:r>
-              <w:rPr>
-                <w:rFonts w:ascii="Times New Roman" w:hAnsi="Times New Roman" w:eastAsia="SimSun"/>
-                <w:b/>
-                <w:sz w:val="21"/>
-              </w:rPr>
-              <w:t>最终 NDCG@10</w:t>
-            </w:r>
-          </w:p>
-        </w:tc>
-        <w:tc>
-          <w:tcPr>
-            <w:tcW w:type="dxa" w:w="1930"/>
-            <w:vAlign w:val="center"/>
-            <w:shd w:fill="D9EAF7"/>
-          </w:tcPr>
-          <w:p>
-            <w:pPr>
-              <w:jc w:val="center"/>
-            </w:pPr>
-            <w:r/>
-            <w:r>
-              <w:rPr>
-                <w:rFonts w:ascii="Times New Roman" w:hAnsi="Times New Roman" w:eastAsia="SimSun"/>
-                <w:b/>
-                <w:sz w:val="21"/>
-              </w:rPr>
-              <w:t>绝对提升</w:t>
-            </w:r>
-          </w:p>
-        </w:tc>
-        <w:tc>
-          <w:tcPr>
-            <w:tcW w:type="dxa" w:w="1930"/>
-            <w:vAlign w:val="center"/>
-            <w:shd w:fill="D9EAF7"/>
-          </w:tcPr>
-          <w:p>
-            <w:pPr>
-              <w:jc w:val="center"/>
-            </w:pPr>
-            <w:r/>
-            <w:r>
-              <w:rPr>
-                <w:rFonts w:ascii="Times New Roman" w:hAnsi="Times New Roman" w:eastAsia="SimSun"/>
-                <w:b/>
-                <w:sz w:val="21"/>
-              </w:rPr>
-              <w:t>相对提升</w:t>
-            </w:r>
-          </w:p>
-        </w:tc>
-      </w:tr>
-      <w:tr>
-        <w:tc>
-          <w:tcPr>
-            <w:tcW w:type="dxa" w:w="1930"/>
+            <w:tcW w:type="dxa" w:w="2412"/>
             <w:vAlign w:val="center"/>
           </w:tcPr>
           <w:p>
@@ -1263,17 +736,17 @@
             <w:r/>
             <w:r>
               <w:rPr>
-                <w:rFonts w:ascii="Times New Roman" w:hAnsi="Times New Roman" w:eastAsia="SimSun"/>
+                <w:rFonts w:eastAsia="SimSun" w:ascii="Times New Roman" w:hAnsi="Times New Roman"/>
                 <w:b w:val="0"/>
                 <w:sz w:val="21"/>
               </w:rPr>
-              <w:t>Musical_Instruments</w:t>
+              <w:t>Weighted Average</w:t>
             </w:r>
           </w:p>
         </w:tc>
         <w:tc>
           <w:tcPr>
-            <w:tcW w:type="dxa" w:w="1930"/>
+            <w:tcW w:type="dxa" w:w="2412"/>
             <w:vAlign w:val="center"/>
           </w:tcPr>
           <w:p>
@@ -1283,17 +756,17 @@
             <w:r/>
             <w:r>
               <w:rPr>
-                <w:rFonts w:ascii="Times New Roman" w:hAnsi="Times New Roman" w:eastAsia="SimSun"/>
+                <w:rFonts w:eastAsia="SimSun" w:ascii="Times New Roman" w:hAnsi="Times New Roman"/>
                 <w:b w:val="0"/>
                 <w:sz w:val="21"/>
               </w:rPr>
-              <w:t>0.0340</w:t>
+              <w:t>232300</w:t>
             </w:r>
           </w:p>
         </w:tc>
         <w:tc>
           <w:tcPr>
-            <w:tcW w:type="dxa" w:w="1930"/>
+            <w:tcW w:type="dxa" w:w="2412"/>
             <w:vAlign w:val="center"/>
           </w:tcPr>
           <w:p>
@@ -1303,17 +776,16 @@
             <w:r/>
             <w:r>
               <w:rPr>
-                <w:rFonts w:ascii="Times New Roman" w:hAnsi="Times New Roman" w:eastAsia="SimSun"/>
+                <w:rFonts w:eastAsia="SimSun" w:ascii="Times New Roman" w:hAnsi="Times New Roman"/>
                 <w:b w:val="0"/>
                 <w:sz w:val="21"/>
               </w:rPr>
-              <w:t>0.0383</w:t>
             </w:r>
           </w:p>
         </w:tc>
         <w:tc>
           <w:tcPr>
-            <w:tcW w:type="dxa" w:w="1930"/>
+            <w:tcW w:type="dxa" w:w="2412"/>
             <w:vAlign w:val="center"/>
           </w:tcPr>
           <w:p>
@@ -1323,447 +795,68 @@
             <w:r/>
             <w:r>
               <w:rPr>
-                <w:rFonts w:ascii="Times New Roman" w:hAnsi="Times New Roman" w:eastAsia="SimSun"/>
+                <w:rFonts w:eastAsia="SimSun" w:ascii="Times New Roman" w:hAnsi="Times New Roman"/>
                 <w:b w:val="0"/>
                 <w:sz w:val="21"/>
               </w:rPr>
-              <w:t>+0.0043</w:t>
-            </w:r>
-          </w:p>
-        </w:tc>
-        <w:tc>
-          <w:tcPr>
-            <w:tcW w:type="dxa" w:w="1930"/>
-            <w:vAlign w:val="center"/>
-          </w:tcPr>
-          <w:p>
-            <w:pPr>
-              <w:jc w:val="center"/>
-            </w:pPr>
-            <w:r/>
-            <w:r>
-              <w:rPr>
-                <w:rFonts w:ascii="Times New Roman" w:hAnsi="Times New Roman" w:eastAsia="SimSun"/>
-                <w:b w:val="0"/>
-                <w:sz w:val="21"/>
-              </w:rPr>
-              <w:t>+12.6%</w:t>
-            </w:r>
-          </w:p>
-        </w:tc>
-      </w:tr>
-      <w:tr>
-        <w:tc>
-          <w:tcPr>
-            <w:tcW w:type="dxa" w:w="1930"/>
-            <w:vAlign w:val="center"/>
-          </w:tcPr>
-          <w:p>
-            <w:pPr>
-              <w:jc w:val="center"/>
-            </w:pPr>
-            <w:r/>
-            <w:r>
-              <w:rPr>
-                <w:rFonts w:ascii="Times New Roman" w:hAnsi="Times New Roman" w:eastAsia="SimSun"/>
-                <w:b w:val="0"/>
-                <w:sz w:val="21"/>
-              </w:rPr>
-              <w:t>Industrial_and_Scientific</w:t>
-            </w:r>
-          </w:p>
-        </w:tc>
-        <w:tc>
-          <w:tcPr>
-            <w:tcW w:type="dxa" w:w="1930"/>
-            <w:vAlign w:val="center"/>
-          </w:tcPr>
-          <w:p>
-            <w:pPr>
-              <w:jc w:val="center"/>
-            </w:pPr>
-            <w:r/>
-            <w:r>
-              <w:rPr>
-                <w:rFonts w:ascii="Times New Roman" w:hAnsi="Times New Roman" w:eastAsia="SimSun"/>
-                <w:b w:val="0"/>
-                <w:sz w:val="21"/>
-              </w:rPr>
-              <w:t>0.0267</w:t>
-            </w:r>
-          </w:p>
-        </w:tc>
-        <w:tc>
-          <w:tcPr>
-            <w:tcW w:type="dxa" w:w="1930"/>
-            <w:vAlign w:val="center"/>
-          </w:tcPr>
-          <w:p>
-            <w:pPr>
-              <w:jc w:val="center"/>
-            </w:pPr>
-            <w:r/>
-            <w:r>
-              <w:rPr>
-                <w:rFonts w:ascii="Times New Roman" w:hAnsi="Times New Roman" w:eastAsia="SimSun"/>
-                <w:b w:val="0"/>
-                <w:sz w:val="21"/>
-              </w:rPr>
-              <w:t>0.0311</w:t>
-            </w:r>
-          </w:p>
-        </w:tc>
-        <w:tc>
-          <w:tcPr>
-            <w:tcW w:type="dxa" w:w="1930"/>
-            <w:vAlign w:val="center"/>
-          </w:tcPr>
-          <w:p>
-            <w:pPr>
-              <w:jc w:val="center"/>
-            </w:pPr>
-            <w:r/>
-            <w:r>
-              <w:rPr>
-                <w:rFonts w:ascii="Times New Roman" w:hAnsi="Times New Roman" w:eastAsia="SimSun"/>
-                <w:b w:val="0"/>
-                <w:sz w:val="21"/>
-              </w:rPr>
-              <w:t>+0.0044</w:t>
-            </w:r>
-          </w:p>
-        </w:tc>
-        <w:tc>
-          <w:tcPr>
-            <w:tcW w:type="dxa" w:w="1930"/>
-            <w:vAlign w:val="center"/>
-          </w:tcPr>
-          <w:p>
-            <w:pPr>
-              <w:jc w:val="center"/>
-            </w:pPr>
-            <w:r/>
-            <w:r>
-              <w:rPr>
-                <w:rFonts w:ascii="Times New Roman" w:hAnsi="Times New Roman" w:eastAsia="SimSun"/>
-                <w:b w:val="0"/>
-                <w:sz w:val="21"/>
-              </w:rPr>
-              <w:t>+16.6%</w:t>
-            </w:r>
-          </w:p>
-        </w:tc>
-      </w:tr>
-      <w:tr>
-        <w:tc>
-          <w:tcPr>
-            <w:tcW w:type="dxa" w:w="1930"/>
-            <w:vAlign w:val="center"/>
-          </w:tcPr>
-          <w:p>
-            <w:pPr>
-              <w:jc w:val="center"/>
-            </w:pPr>
-            <w:r/>
-            <w:r>
-              <w:rPr>
-                <w:rFonts w:ascii="Times New Roman" w:hAnsi="Times New Roman" w:eastAsia="SimSun"/>
-                <w:b w:val="0"/>
-                <w:sz w:val="21"/>
-              </w:rPr>
-              <w:t>CDs_and_Vinyl</w:t>
-            </w:r>
-          </w:p>
-        </w:tc>
-        <w:tc>
-          <w:tcPr>
-            <w:tcW w:type="dxa" w:w="1930"/>
-            <w:vAlign w:val="center"/>
-          </w:tcPr>
-          <w:p>
-            <w:pPr>
-              <w:jc w:val="center"/>
-            </w:pPr>
-            <w:r/>
-            <w:r>
-              <w:rPr>
-                <w:rFonts w:ascii="Times New Roman" w:hAnsi="Times New Roman" w:eastAsia="SimSun"/>
-                <w:b w:val="0"/>
-                <w:sz w:val="21"/>
-              </w:rPr>
-              <w:t>0.0368</w:t>
-            </w:r>
-          </w:p>
-        </w:tc>
-        <w:tc>
-          <w:tcPr>
-            <w:tcW w:type="dxa" w:w="1930"/>
-            <w:vAlign w:val="center"/>
-          </w:tcPr>
-          <w:p>
-            <w:pPr>
-              <w:jc w:val="center"/>
-            </w:pPr>
-            <w:r/>
-            <w:r>
-              <w:rPr>
-                <w:rFonts w:ascii="Times New Roman" w:hAnsi="Times New Roman" w:eastAsia="SimSun"/>
-                <w:b w:val="0"/>
-                <w:sz w:val="21"/>
-              </w:rPr>
-              <w:t>0.0553</w:t>
-            </w:r>
-          </w:p>
-        </w:tc>
-        <w:tc>
-          <w:tcPr>
-            <w:tcW w:type="dxa" w:w="1930"/>
-            <w:vAlign w:val="center"/>
-          </w:tcPr>
-          <w:p>
-            <w:pPr>
-              <w:jc w:val="center"/>
-            </w:pPr>
-            <w:r/>
-            <w:r>
-              <w:rPr>
-                <w:rFonts w:ascii="Times New Roman" w:hAnsi="Times New Roman" w:eastAsia="SimSun"/>
-                <w:b w:val="0"/>
-                <w:sz w:val="21"/>
-              </w:rPr>
-              <w:t>+0.0185</w:t>
-            </w:r>
-          </w:p>
-        </w:tc>
-        <w:tc>
-          <w:tcPr>
-            <w:tcW w:type="dxa" w:w="1930"/>
-            <w:vAlign w:val="center"/>
-          </w:tcPr>
-          <w:p>
-            <w:pPr>
-              <w:jc w:val="center"/>
-            </w:pPr>
-            <w:r/>
-            <w:r>
-              <w:rPr>
-                <w:rFonts w:ascii="Times New Roman" w:hAnsi="Times New Roman" w:eastAsia="SimSun"/>
-                <w:b w:val="0"/>
-                <w:sz w:val="21"/>
-              </w:rPr>
-              <w:t>+50.1%</w:t>
-            </w:r>
-          </w:p>
-        </w:tc>
-      </w:tr>
-      <w:tr>
-        <w:tc>
-          <w:tcPr>
-            <w:tcW w:type="dxa" w:w="1930"/>
-            <w:vAlign w:val="center"/>
-          </w:tcPr>
-          <w:p>
-            <w:pPr>
-              <w:jc w:val="center"/>
-            </w:pPr>
-            <w:r/>
-            <w:r>
-              <w:rPr>
-                <w:rFonts w:ascii="Times New Roman" w:hAnsi="Times New Roman" w:eastAsia="SimSun"/>
-                <w:b w:val="0"/>
-                <w:sz w:val="21"/>
-              </w:rPr>
-              <w:t>平均</w:t>
-            </w:r>
-          </w:p>
-        </w:tc>
-        <w:tc>
-          <w:tcPr>
-            <w:tcW w:type="dxa" w:w="1930"/>
-            <w:vAlign w:val="center"/>
-          </w:tcPr>
-          <w:p>
-            <w:pPr>
-              <w:jc w:val="center"/>
-            </w:pPr>
-            <w:r/>
-            <w:r>
-              <w:rPr>
-                <w:rFonts w:ascii="Times New Roman" w:hAnsi="Times New Roman" w:eastAsia="SimSun"/>
-                <w:b w:val="0"/>
-                <w:sz w:val="21"/>
-              </w:rPr>
-              <w:t>0.0325</w:t>
-            </w:r>
-          </w:p>
-        </w:tc>
-        <w:tc>
-          <w:tcPr>
-            <w:tcW w:type="dxa" w:w="1930"/>
-            <w:vAlign w:val="center"/>
-          </w:tcPr>
-          <w:p>
-            <w:pPr>
-              <w:jc w:val="center"/>
-            </w:pPr>
-            <w:r/>
-            <w:r>
-              <w:rPr>
-                <w:rFonts w:ascii="Times New Roman" w:hAnsi="Times New Roman" w:eastAsia="SimSun"/>
-                <w:b w:val="0"/>
-                <w:sz w:val="21"/>
-              </w:rPr>
-              <w:t>0.0416</w:t>
-            </w:r>
-          </w:p>
-        </w:tc>
-        <w:tc>
-          <w:tcPr>
-            <w:tcW w:type="dxa" w:w="1930"/>
-            <w:vAlign w:val="center"/>
-          </w:tcPr>
-          <w:p>
-            <w:pPr>
-              <w:jc w:val="center"/>
-            </w:pPr>
-            <w:r/>
-            <w:r>
-              <w:rPr>
-                <w:rFonts w:ascii="Times New Roman" w:hAnsi="Times New Roman" w:eastAsia="SimSun"/>
-                <w:b w:val="0"/>
-                <w:sz w:val="21"/>
-              </w:rPr>
-              <w:t>+0.0091</w:t>
-            </w:r>
-          </w:p>
-        </w:tc>
-        <w:tc>
-          <w:tcPr>
-            <w:tcW w:type="dxa" w:w="1930"/>
-            <w:vAlign w:val="center"/>
-          </w:tcPr>
-          <w:p>
-            <w:pPr>
-              <w:jc w:val="center"/>
-            </w:pPr>
-            <w:r/>
-            <w:r>
-              <w:rPr>
-                <w:rFonts w:ascii="Times New Roman" w:hAnsi="Times New Roman" w:eastAsia="SimSun"/>
-                <w:b w:val="0"/>
-                <w:sz w:val="21"/>
-              </w:rPr>
-              <w:t>+27.9%</w:t>
+              <w:t>0.0458</w:t>
             </w:r>
           </w:p>
         </w:tc>
       </w:tr>
     </w:tbl>
-    <w:p/>
     <w:p>
-      <w:pPr>
-        <w:spacing w:line="276" w:lineRule="auto"/>
-        <w:ind w:firstLine="440"/>
-      </w:pPr>
       <w:r>
         <w:rPr>
-          <w:rFonts w:ascii="Times New Roman" w:hAnsi="Times New Roman" w:eastAsia="SimSun"/>
+          <w:rFonts w:eastAsia="SimSun" w:ascii="Times New Roman" w:hAnsi="Times New Roman"/>
           <w:sz w:val="22"/>
         </w:rPr>
-        <w:t>三个数据集的 NDCG@10 均高于原始 UniSRec，其中 CDs_and_Vinyl 提升最明显。整体来看，商品 metadata、用户历史评分和时间特征能够补充原始文本序列模型的信息，多个序列模型的 RRF 融合也能提升 Top-10 排序稳定性。</w:t>
-      </w:r>
-    </w:p>
-    <w:p>
-      <w:pPr>
-        <w:pStyle w:val="Heading1"/>
-      </w:pPr>
-      <w:r>
-        <w:rPr>
-          <w:rFonts w:ascii="Times New Roman" w:hAnsi="Times New Roman" w:eastAsia="SimSun"/>
-          <w:b/>
-          <w:sz w:val="28"/>
-        </w:rPr>
-        <w:t>六、结果复算</w:t>
-      </w:r>
-    </w:p>
-    <w:p>
-      <w:pPr>
-        <w:spacing w:line="276" w:lineRule="auto"/>
-        <w:ind w:firstLine="440"/>
-      </w:pPr>
-      <w:r>
-        <w:rPr>
-          <w:rFonts w:ascii="Times New Roman" w:hAnsi="Times New Roman" w:eastAsia="SimSun"/>
-          <w:sz w:val="22"/>
-        </w:rPr>
-        <w:t>提交包中提供 final_results.csv、results_top10 目录和 evaluate_ndcg10.py。解压后可运行以下命令复算 Recall@10 和 NDCG@10：</w:t>
+        <w:t>三个类别均按作业要求在测试集上汇报结果。</w:t>
       </w:r>
     </w:p>
     <w:p>
       <w:r>
         <w:rPr>
-          <w:rFonts w:ascii="Times New Roman" w:hAnsi="Times New Roman" w:eastAsia="SimSun"/>
-          <w:sz w:val="18"/>
+          <w:rFonts w:eastAsia="SimSun" w:ascii="Times New Roman" w:hAnsi="Times New Roman"/>
+          <w:b/>
+          <w:sz w:val="26"/>
         </w:rPr>
-        <w:t>python evaluate_ndcg10.py results_top10/mi-rrf-rich-8-1-1-1-8-top10.jsonl results_top10/industrial-rrf-rich-4-1-1-1-8-top10.jsonl results_top10/cds-rrf-rich-fine-k60-1-0p04-0p04-0p04-top10.jsonl</w:t>
-      </w:r>
-    </w:p>
-    <w:p>
-      <w:pPr>
-        <w:spacing w:line="276" w:lineRule="auto"/>
-        <w:ind w:firstLine="440"/>
-      </w:pPr>
-      <w:r>
-        <w:t>checkpoint 文件体积较大，未放入邮件附件。GitHub 仓库的 models/checkpoints/ 目录保留了主要模型参数，使用 Git LFS 管理；克隆仓库后执行 git lfs pull 即可下载完整 checkpoint。</w:t>
-      </w:r>
-    </w:p>
-    <w:p>
-      <w:pPr>
-        <w:pStyle w:val="Heading1"/>
-      </w:pPr>
-      <w:r>
-        <w:rPr>
-          <w:rFonts w:ascii="SimSun" w:hAnsi="SimSun"/>
-          <w:sz w:val="21"/>
-        </w:rPr>
-        <w:t>七、复现说明</w:t>
+        <w:t>五、结果文件</w:t>
       </w:r>
     </w:p>
     <w:p>
       <w:r>
         <w:rPr>
-          <w:rFonts w:ascii="SimSun" w:hAnsi="SimSun"/>
-          <w:sz w:val="21"/>
+          <w:rFonts w:eastAsia="SimSun" w:ascii="Times New Roman" w:hAnsi="Times New Roman"/>
+          <w:sz w:val="22"/>
         </w:rPr>
-        <w:t>本实验提供三种复现方式：快速复算最终分数，加载已训练 checkpoint 重新导出结果，以及可选的完整重新训练。</w:t>
-      </w:r>
-    </w:p>
-    <w:p>
-      <w:pPr>
-        <w:pStyle w:val="Heading2"/>
-      </w:pPr>
-      <w:r>
-        <w:rPr>
-          <w:rFonts w:ascii="SimSun" w:hAnsi="SimSun"/>
-          <w:sz w:val="21"/>
-        </w:rPr>
-        <w:t>1. 快速复算最终指标</w:t>
+        <w:t>最终指标汇总保存在 final_results.csv，三个数据集的 Top-10 推荐结果保存在 results_top10/ 目录。evaluate_ndcg10.py 可用于复算 Recall@10 和 NDCG@10。</w:t>
       </w:r>
     </w:p>
     <w:p>
       <w:r>
         <w:rPr>
-          <w:rFonts w:ascii="SimSun" w:hAnsi="SimSun"/>
-          <w:sz w:val="21"/>
+          <w:rFonts w:eastAsia="SimSun" w:ascii="Times New Roman" w:hAnsi="Times New Roman"/>
+          <w:b/>
+          <w:sz w:val="26"/>
         </w:rPr>
-        <w:t>解压邮件附件后，在提交包根目录运行：</w:t>
+        <w:t>六、复现说明</w:t>
       </w:r>
     </w:p>
     <w:p>
       <w:r>
         <w:rPr>
-          <w:rFonts w:ascii="Courier New" w:hAnsi="Courier New"/>
-          <w:sz w:val="18"/>
+          <w:rFonts w:eastAsia="SimSun" w:ascii="Times New Roman" w:hAnsi="Times New Roman"/>
+          <w:sz w:val="22"/>
+        </w:rPr>
+        <w:t>如果只需要核验最终指标，在项目根目录运行：</w:t>
+      </w:r>
+    </w:p>
+    <w:p>
+      <w:r>
+        <w:rPr>
+          <w:rFonts w:eastAsia="SimSun" w:ascii="Times New Roman" w:hAnsi="Times New Roman"/>
+          <w:sz w:val="22"/>
         </w:rPr>
         <w:t>python evaluate_ndcg10.py results_top10/mi-rrf-rich-8-1-1-1-8-top10.jsonl results_top10/industrial-rrf-rich-4-1-1-1-8-top10.jsonl results_top10/cds-rrf-rich-fine-k60-1-0p04-0p04-0p04-top10.jsonl</w:t>
       </w:r>
@@ -1771,38 +864,17 @@
     <w:p>
       <w:r>
         <w:rPr>
-          <w:rFonts w:ascii="SimSun" w:hAnsi="SimSun"/>
-          <w:sz w:val="21"/>
+          <w:rFonts w:eastAsia="SimSun" w:ascii="Times New Roman" w:hAnsi="Times New Roman"/>
+          <w:sz w:val="22"/>
         </w:rPr>
-        <w:t>该命令直接使用提交包中的 results_top10 文件复算 Recall@10 和 NDCG@10，输出应与 final_results.csv 一致。</w:t>
-      </w:r>
-    </w:p>
-    <w:p>
-      <w:pPr>
-        <w:pStyle w:val="Heading2"/>
-      </w:pPr>
-      <w:r>
-        <w:rPr>
-          <w:rFonts w:ascii="SimSun" w:hAnsi="SimSun"/>
-          <w:sz w:val="21"/>
-        </w:rPr>
-        <w:t>2. 加载 checkpoint 重新导出最终结果</w:t>
+        <w:t>如果需要加载模型参数重新生成结果，先从 GitHub 仓库下载完整 checkpoint：</w:t>
       </w:r>
     </w:p>
     <w:p>
       <w:r>
         <w:rPr>
-          <w:rFonts w:ascii="SimSun" w:hAnsi="SimSun"/>
-          <w:sz w:val="21"/>
-        </w:rPr>
-        <w:t>邮件附件不包含 checkpoint。完整模型参数保存在 GitHub 仓库的 models/checkpoints/ 目录中，使用 Git LFS 管理。先获取仓库和参数：</w:t>
-      </w:r>
-    </w:p>
-    <w:p>
-      <w:r>
-        <w:rPr>
-          <w:rFonts w:ascii="Courier New" w:hAnsi="Courier New"/>
-          <w:sz w:val="18"/>
+          <w:rFonts w:eastAsia="SimSun" w:ascii="Times New Roman" w:hAnsi="Times New Roman"/>
+          <w:sz w:val="22"/>
         </w:rPr>
         <w:t>git clone https://github.com/just-nobody555/recsys-final-project.git</w:t>
       </w:r>
@@ -1810,8 +882,8 @@
     <w:p>
       <w:r>
         <w:rPr>
-          <w:rFonts w:ascii="Courier New" w:hAnsi="Courier New"/>
-          <w:sz w:val="18"/>
+          <w:rFonts w:eastAsia="SimSun" w:ascii="Times New Roman" w:hAnsi="Times New Roman"/>
+          <w:sz w:val="22"/>
         </w:rPr>
         <w:t>cd recsys-final-project</w:t>
       </w:r>
@@ -1819,8 +891,8 @@
     <w:p>
       <w:r>
         <w:rPr>
-          <w:rFonts w:ascii="Courier New" w:hAnsi="Courier New"/>
-          <w:sz w:val="18"/>
+          <w:rFonts w:eastAsia="SimSun" w:ascii="Times New Roman" w:hAnsi="Times New Roman"/>
+          <w:sz w:val="22"/>
         </w:rPr>
         <w:t>git lfs install</w:t>
       </w:r>
@@ -1828,8 +900,8 @@
     <w:p>
       <w:r>
         <w:rPr>
-          <w:rFonts w:ascii="Courier New" w:hAnsi="Courier New"/>
-          <w:sz w:val="18"/>
+          <w:rFonts w:eastAsia="SimSun" w:ascii="Times New Roman" w:hAnsi="Times New Roman"/>
+          <w:sz w:val="22"/>
         </w:rPr>
         <w:t>git lfs pull</w:t>
       </w:r>
@@ -1837,17 +909,8 @@
     <w:p>
       <w:r>
         <w:rPr>
-          <w:rFonts w:ascii="SimSun" w:hAnsi="SimSun"/>
-          <w:sz w:val="21"/>
-        </w:rPr>
-        <w:t>进入代码目录并安装依赖：</w:t>
-      </w:r>
-    </w:p>
-    <w:p>
-      <w:r>
-        <w:rPr>
-          <w:rFonts w:ascii="Courier New" w:hAnsi="Courier New"/>
-          <w:sz w:val="18"/>
+          <w:rFonts w:eastAsia="SimSun" w:ascii="Times New Roman" w:hAnsi="Times New Roman"/>
+          <w:sz w:val="22"/>
         </w:rPr>
         <w:t>cd code/recommend-system-main</w:t>
       </w:r>
@@ -1855,8 +918,8 @@
     <w:p>
       <w:r>
         <w:rPr>
-          <w:rFonts w:ascii="Courier New" w:hAnsi="Courier New"/>
-          <w:sz w:val="18"/>
+          <w:rFonts w:eastAsia="SimSun" w:ascii="Times New Roman" w:hAnsi="Times New Roman"/>
+          <w:sz w:val="22"/>
         </w:rPr>
         <w:t>pip install -r requirements.txt</w:t>
       </w:r>
@@ -1864,8 +927,8 @@
     <w:p>
       <w:r>
         <w:rPr>
-          <w:rFonts w:ascii="Courier New" w:hAnsi="Courier New"/>
-          <w:sz w:val="18"/>
+          <w:rFonts w:eastAsia="SimSun" w:ascii="Times New Roman" w:hAnsi="Times New Roman"/>
+          <w:sz w:val="22"/>
         </w:rPr>
         <w:t>python scripts/check_environment.py</w:t>
       </w:r>
@@ -1873,17 +936,8 @@
     <w:p>
       <w:r>
         <w:rPr>
-          <w:rFonts w:ascii="SimSun" w:hAnsi="SimSun"/>
-          <w:sz w:val="21"/>
-        </w:rPr>
-        <w:t>下载作业 PDF 中对应的三个数据集。代码中把 dev 命名为 valid：</w:t>
-      </w:r>
-    </w:p>
-    <w:p>
-      <w:r>
-        <w:rPr>
-          <w:rFonts w:ascii="Courier New" w:hAnsi="Courier New"/>
-          <w:sz w:val="18"/>
+          <w:rFonts w:eastAsia="SimSun" w:ascii="Times New Roman" w:hAnsi="Times New Roman"/>
+          <w:sz w:val="22"/>
         </w:rPr>
         <w:t>python scripts/download_course_data.py --domain Musical_Instruments</w:t>
       </w:r>
@@ -1891,8 +945,8 @@
     <w:p>
       <w:r>
         <w:rPr>
-          <w:rFonts w:ascii="Courier New" w:hAnsi="Courier New"/>
-          <w:sz w:val="18"/>
+          <w:rFonts w:eastAsia="SimSun" w:ascii="Times New Roman" w:hAnsi="Times New Roman"/>
+          <w:sz w:val="22"/>
         </w:rPr>
         <w:t>python scripts/download_course_data.py --domain Industrial_and_Scientific</w:t>
       </w:r>
@@ -1900,8 +954,8 @@
     <w:p>
       <w:r>
         <w:rPr>
-          <w:rFonts w:ascii="Courier New" w:hAnsi="Courier New"/>
-          <w:sz w:val="18"/>
+          <w:rFonts w:eastAsia="SimSun" w:ascii="Times New Roman" w:hAnsi="Times New Roman"/>
+          <w:sz w:val="22"/>
         </w:rPr>
         <w:t>python scripts/download_course_data.py --domain CDs_and_Vinyl</w:t>
       </w:r>
@@ -1909,80 +963,8 @@
     <w:p>
       <w:r>
         <w:rPr>
-          <w:rFonts w:ascii="SimSun" w:hAnsi="SimSun"/>
-          <w:sz w:val="21"/>
-        </w:rPr>
-        <w:t>处理普通数据和 Rich 数据。下面是加载 checkpoint 导出结果所需的处理命令：</w:t>
-      </w:r>
-    </w:p>
-    <w:p>
-      <w:r>
-        <w:rPr>
-          <w:rFonts w:ascii="Courier New" w:hAnsi="Courier New"/>
-          <w:sz w:val="18"/>
-        </w:rPr>
-        <w:t>python dataset/process_amazon.py --domain Musical_Instruments --device cuda --output_dir dataset/processed</w:t>
-      </w:r>
-    </w:p>
-    <w:p>
-      <w:r>
-        <w:rPr>
-          <w:rFonts w:ascii="Courier New" w:hAnsi="Courier New"/>
-          <w:sz w:val="18"/>
-        </w:rPr>
-        <w:t>python dataset/process_amazon.py --domain Industrial_and_Scientific --device cuda --output_dir dataset/processed</w:t>
-      </w:r>
-    </w:p>
-    <w:p>
-      <w:r>
-        <w:rPr>
-          <w:rFonts w:ascii="Courier New" w:hAnsi="Courier New"/>
-          <w:sz w:val="18"/>
-        </w:rPr>
-        <w:t>python dataset/process_amazon.py --domain CDs_and_Vinyl --device cuda --output_dir dataset/processed --skip_plm_features</w:t>
-      </w:r>
-    </w:p>
-    <w:p>
-      <w:r>
-        <w:rPr>
-          <w:rFonts w:ascii="Courier New" w:hAnsi="Courier New"/>
-          <w:sz w:val="18"/>
-        </w:rPr>
-        <w:t>python dataset/process_amazon.py --domain Musical_Instruments --device cuda --output_dir dataset/processed --output_domain Musical_Instruments_Rich --rich_metadata --with_user_features</w:t>
-      </w:r>
-    </w:p>
-    <w:p>
-      <w:r>
-        <w:rPr>
-          <w:rFonts w:ascii="Courier New" w:hAnsi="Courier New"/>
-          <w:sz w:val="18"/>
-        </w:rPr>
-        <w:t>python dataset/process_amazon.py --domain Industrial_and_Scientific --device cuda --output_dir dataset/processed --output_domain Industrial_and_Scientific_Rich --rich_metadata --with_user_features</w:t>
-      </w:r>
-    </w:p>
-    <w:p>
-      <w:r>
-        <w:rPr>
-          <w:rFonts w:ascii="Courier New" w:hAnsi="Courier New"/>
-          <w:sz w:val="18"/>
-        </w:rPr>
-        <w:t>python dataset/process_amazon.py --domain CDs_and_Vinyl --device cuda --output_dir dataset/processed --output_domain CDs_and_Vinyl_Rich --rich_metadata --with_user_features</w:t>
-      </w:r>
-    </w:p>
-    <w:p>
-      <w:r>
-        <w:rPr>
-          <w:rFonts w:ascii="SimSun" w:hAnsi="SimSun"/>
-          <w:sz w:val="21"/>
-        </w:rPr>
-        <w:t>然后直接加载 models/checkpoints/ 中的模型参数，重新导出 test ranklist 并做 RRF 融合：</w:t>
-      </w:r>
-    </w:p>
-    <w:p>
-      <w:r>
-        <w:rPr>
-          <w:rFonts w:ascii="Courier New" w:hAnsi="Courier New"/>
-          <w:sz w:val="18"/>
+          <w:rFonts w:eastAsia="SimSun" w:ascii="Times New Roman" w:hAnsi="Times New Roman"/>
+          <w:sz w:val="22"/>
         </w:rPr>
         <w:t>bash scripts/reproduce_from_checkpoints.sh</w:t>
       </w:r>
@@ -1990,36 +972,14 @@
     <w:p>
       <w:r>
         <w:rPr>
-          <w:rFonts w:ascii="SimSun" w:hAnsi="SimSun"/>
-          <w:sz w:val="21"/>
+          <w:rFonts w:eastAsia="SimSun" w:ascii="Times New Roman" w:hAnsi="Times New Roman"/>
+          <w:sz w:val="22"/>
         </w:rPr>
-        <w:t>该脚本会调用 scripts/export_ranklist.py 读取 checkpoint，再调用 scripts/rrf_fusion.py 融合多个模型的排序结果，最后使用 evaluate_ndcg10.py 输出三个数据集的 Recall@10 和 NDCG@10。</w:t>
-      </w:r>
-    </w:p>
-    <w:p>
-      <w:pPr>
-        <w:pStyle w:val="Heading2"/>
-      </w:pPr>
-      <w:r>
-        <w:rPr>
-          <w:rFonts w:ascii="SimSun" w:hAnsi="SimSun"/>
-          <w:sz w:val="21"/>
-        </w:rPr>
-        <w:t>3. 可选的完整重新训练</w:t>
-      </w:r>
-    </w:p>
-    <w:p>
-      <w:r>
-        <w:rPr>
-          <w:rFonts w:ascii="SimSun" w:hAnsi="SimSun"/>
-          <w:sz w:val="21"/>
-        </w:rPr>
-        <w:t>如果需要从头重新训练，可使用 run.py。模型配置位于 config/，训练后可用 scripts/export_ranklist.py 导出排序结果，再用 scripts/rrf_fusion.py 融合。完整重训需要 CUDA 环境和较长时间；若只核验最终分数，使用第 1 或第 2 种方式即可。</w:t>
+        <w:t>原始数据和处理后的特征文件体积较大，未直接放入提交包，可按上面步骤重新生成。</w:t>
       </w:r>
     </w:p>
     <w:sectPr>
       <w:footerReference w:type="default" r:id="rId9"/>
-      <w:headerReference w:type="default" r:id="rId10"/>
       <w:pgSz w:w="12240" w:h="15840"/>
       <w:pgMar w:top="1152" w:right="1296" w:bottom="1152" w:left="1296" w:header="720" w:footer="720" w:gutter="0"/>
       <w:cols w:space="720"/>
@@ -2034,21 +994,9 @@
   <w:p>
     <w:pPr>
       <w:pStyle w:val="Footer"/>
-      <w:jc w:val="center"/>
-    </w:pPr>
-    <w:r/>
+    </w:pPr>
   </w:p>
 </w:ftr>
-</file>
-
-<file path=word/header1.xml><?xml version="1.0" encoding="utf-8"?>
-<w:hdr xmlns:m="http://schemas.openxmlformats.org/officeDocument/2006/math" xmlns:mc="http://schemas.openxmlformats.org/markup-compatibility/2006" xmlns:mo="http://schemas.microsoft.com/office/mac/office/2008/main" xmlns:mv="urn:schemas-microsoft-com:mac:vml" xmlns:o="urn:schemas-microsoft-com:office:office" xmlns:r="http://schemas.openxmlformats.org/officeDocument/2006/relationships" xmlns:v="urn:schemas-microsoft-com:vml" xmlns:w10="urn:schemas-microsoft-com:office:word" xmlns:w14="http://schemas.microsoft.com/office/word/2010/wordml" xmlns:w="http://schemas.openxmlformats.org/wordprocessingml/2006/main" xmlns:wne="http://schemas.microsoft.com/office/word/2006/wordml" xmlns:wp14="http://schemas.microsoft.com/office/word/2010/wordprocessingDrawing" xmlns:wp="http://schemas.openxmlformats.org/drawingml/2006/wordprocessingDrawing" xmlns:wpc="http://schemas.microsoft.com/office/word/2010/wordprocessingCanvas" xmlns:wpg="http://schemas.microsoft.com/office/word/2010/wordprocessingGroup" xmlns:wpi="http://schemas.microsoft.com/office/word/2010/wordprocessingInk" xmlns:wps="http://schemas.microsoft.com/office/word/2010/wordprocessingShape" mc:Ignorable="w14 wp14">
-  <w:p>
-    <w:pPr>
-      <w:pStyle w:val="Header"/>
-    </w:pPr>
-  </w:p>
-</w:hdr>
 </file>
 
 <file path=word/numbering.xml><?xml version="1.0" encoding="utf-8"?>

</xml_diff>

<commit_message>
Clarify final reproduction workflow
</commit_message>
<xml_diff>
--- a/report.docx
+++ b/report.docx
@@ -867,7 +867,7 @@
           <w:rFonts w:eastAsia="SimSun" w:ascii="Times New Roman" w:hAnsi="Times New Roman"/>
           <w:sz w:val="22"/>
         </w:rPr>
-        <w:t>如果需要加载模型参数重新生成结果，先从 GitHub 仓库下载完整 checkpoint：</w:t>
+        <w:t>如果需要加载模型参数重新生成结果，先从 GitHub 仓库下载完整 checkpoint，然后准备数据并导出结果：</w:t>
       </w:r>
     </w:p>
     <w:p>
@@ -939,25 +939,7 @@
           <w:rFonts w:eastAsia="SimSun" w:ascii="Times New Roman" w:hAnsi="Times New Roman"/>
           <w:sz w:val="22"/>
         </w:rPr>
-        <w:t>python scripts/download_course_data.py --domain Musical_Instruments</w:t>
-      </w:r>
-    </w:p>
-    <w:p>
-      <w:r>
-        <w:rPr>
-          <w:rFonts w:eastAsia="SimSun" w:ascii="Times New Roman" w:hAnsi="Times New Roman"/>
-          <w:sz w:val="22"/>
-        </w:rPr>
-        <w:t>python scripts/download_course_data.py --domain Industrial_and_Scientific</w:t>
-      </w:r>
-    </w:p>
-    <w:p>
-      <w:r>
-        <w:rPr>
-          <w:rFonts w:eastAsia="SimSun" w:ascii="Times New Roman" w:hAnsi="Times New Roman"/>
-          <w:sz w:val="22"/>
-        </w:rPr>
-        <w:t>python scripts/download_course_data.py --domain CDs_and_Vinyl</w:t>
+        <w:t>DEVICE=cuda bash scripts/prepare_all_datasets.sh</w:t>
       </w:r>
     </w:p>
     <w:p>
@@ -975,7 +957,7 @@
           <w:rFonts w:eastAsia="SimSun" w:ascii="Times New Roman" w:hAnsi="Times New Roman"/>
           <w:sz w:val="22"/>
         </w:rPr>
-        <w:t>原始数据和处理后的特征文件体积较大，未直接放入提交包，可按上面步骤重新生成。</w:t>
+        <w:t>原始数据、处理后的特征文件和部分中间文件体积较大，未直接放入邮件提交包，可按上面步骤重新生成。</w:t>
       </w:r>
     </w:p>
     <w:sectPr>

</xml_diff>

<commit_message>
Fill weighted recall result
</commit_message>
<xml_diff>
--- a/report.docx
+++ b/report.docx
@@ -770,16 +770,8 @@
             <w:vAlign w:val="center"/>
           </w:tcPr>
           <w:p>
-            <w:pPr>
-              <w:jc w:val="center"/>
-            </w:pPr>
-            <w:r/>
             <w:r>
-              <w:rPr>
-                <w:rFonts w:eastAsia="SimSun" w:ascii="Times New Roman" w:hAnsi="Times New Roman"/>
-                <w:b w:val="0"/>
-                <w:sz w:val="21"/>
-              </w:rPr>
+              <w:t>0.0939</w:t>
             </w:r>
           </w:p>
         </w:tc>

</xml_diff>